<commit_message>
Add audio NLP functionality and VLC control scripts
- Implemented audio listening and keyword extraction using Vosk for speech recognition in `audio_nlp.py`.
- Created `file_access.py` to handle opening video files in VLC.
- Developed `vlc_controls.py` for controlling VLC playback via D-Bus.
- Added a main script in `main.py` to demonstrate VLC control functionality.
- Included a compiled Python file for text preprocessing in `text_preprocess.py`.
</commit_message>
<xml_diff>
--- a/project_doc.docx
+++ b/project_doc.docx
@@ -4,7 +4,7 @@
   <w:body>
     <w:p>
       <w:pPr>
-        <w:pStyle w:val="668"/>
+        <w:pStyle w:val="896"/>
         <w:numPr>
           <w:ilvl w:val="0"/>
           <w:numId w:val="1"/>
@@ -12,6 +12,7 @@
         <w:pBdr/>
         <w:spacing/>
         <w:ind/>
+        <w:jc w:val="both"/>
         <w:rPr>
           <w:sz w:val="32"/>
           <w:szCs w:val="32"/>
@@ -28,6 +29,374 @@
         <w:rPr>
           <w:sz w:val="32"/>
           <w:szCs w:val="32"/>
+        </w:rPr>
+      </w:r>
+      <w:r>
+        <w:rPr>
+          <w:sz w:val="32"/>
+          <w:szCs w:val="32"/>
+        </w:rPr>
+      </w:r>
+    </w:p>
+    <w:p>
+      <w:pPr>
+        <w:pBdr/>
+        <w:spacing/>
+        <w:ind/>
+        <w:jc w:val="both"/>
+        <w:rPr>
+          <w:color w:val="002060"/>
+          <w:sz w:val="36"/>
+          <w:szCs w:val="36"/>
+          <w:highlight w:val="none"/>
+          <w:u w:val="single"/>
+          <w14:ligatures w14:val="none"/>
+        </w:rPr>
+      </w:pPr>
+      <w:r>
+        <w:rPr>
+          <w:color w:val="002060"/>
+          <w:sz w:val="36"/>
+          <w:szCs w:val="36"/>
+          <w:highlight w:val="none"/>
+          <w:u w:val="single"/>
+        </w:rPr>
+        <w:t xml:space="preserve">17.01.2026</w:t>
+      </w:r>
+      <w:r>
+        <w:rPr>
+          <w:color w:val="002060"/>
+          <w:sz w:val="36"/>
+          <w:szCs w:val="36"/>
+          <w:u w:val="single"/>
+        </w:rPr>
+      </w:r>
+      <w:r>
+        <w:rPr>
+          <w:color w:val="002060"/>
+          <w:sz w:val="36"/>
+          <w:szCs w:val="36"/>
+          <w:highlight w:val="none"/>
+          <w:u w:val="single"/>
+          <w14:ligatures w14:val="none"/>
+        </w:rPr>
+      </w:r>
+    </w:p>
+    <w:p>
+      <w:pPr>
+        <w:pStyle w:val="896"/>
+        <w:numPr>
+          <w:ilvl w:val="0"/>
+          <w:numId w:val="3"/>
+        </w:numPr>
+        <w:pBdr/>
+        <w:spacing/>
+        <w:ind/>
+        <w:jc w:val="both"/>
+        <w:rPr>
+          <w:sz w:val="32"/>
+          <w:szCs w:val="32"/>
+        </w:rPr>
+      </w:pPr>
+      <w:r>
+        <w:rPr>
+          <w:sz w:val="32"/>
+          <w:szCs w:val="32"/>
+          <w:highlight w:val="none"/>
+        </w:rPr>
+        <w:t xml:space="preserve">The </w:t>
+      </w:r>
+      <w:r>
+        <w:rPr>
+          <w:color w:val="0d0d0d" w:themeColor="text1" w:themeTint="F2"/>
+          <w:sz w:val="32"/>
+          <w:szCs w:val="32"/>
+          <w:highlight w:val="none"/>
+        </w:rPr>
+        <w:t xml:space="preserve">official </w:t>
+      </w:r>
+      <w:r>
+        <w:rPr>
+          <w:sz w:val="32"/>
+          <w:szCs w:val="32"/>
+          <w:highlight w:val="none"/>
+        </w:rPr>
+        <w:t xml:space="preserve">VOSK doc recommend to use new words in runtime, rather than training the model.</w:t>
+      </w:r>
+      <w:r>
+        <w:rPr>
+          <w:sz w:val="32"/>
+          <w:szCs w:val="32"/>
+        </w:rPr>
+      </w:r>
+      <w:r>
+        <w:rPr>
+          <w:sz w:val="32"/>
+          <w:szCs w:val="32"/>
+        </w:rPr>
+      </w:r>
+    </w:p>
+    <w:p>
+      <w:pPr>
+        <w:pStyle w:val="896"/>
+        <w:numPr>
+          <w:ilvl w:val="0"/>
+          <w:numId w:val="3"/>
+        </w:numPr>
+        <w:pBdr/>
+        <w:spacing/>
+        <w:ind/>
+        <w:jc w:val="both"/>
+        <w:rPr>
+          <w:sz w:val="32"/>
+          <w:szCs w:val="32"/>
+        </w:rPr>
+      </w:pPr>
+      <w:r>
+        <w:rPr>
+          <w:sz w:val="32"/>
+          <w:szCs w:val="32"/>
+          <w:highlight w:val="none"/>
+        </w:rPr>
+        <w:t xml:space="preserve">Start to learn</w:t>
+      </w:r>
+      <w:r>
+        <w:rPr>
+          <w:color w:val="000000" w:themeColor="text1"/>
+          <w:sz w:val="32"/>
+          <w:szCs w:val="32"/>
+          <w:highlight w:val="none"/>
+        </w:rPr>
+        <w:t xml:space="preserve"> Web Scraping using python.</w:t>
+      </w:r>
+      <w:r>
+        <w:rPr>
+          <w:sz w:val="32"/>
+          <w:szCs w:val="32"/>
+          <w:highlight w:val="none"/>
+        </w:rPr>
+      </w:r>
+      <w:r>
+        <w:rPr>
+          <w:sz w:val="32"/>
+          <w:szCs w:val="32"/>
+        </w:rPr>
+      </w:r>
+    </w:p>
+    <w:p>
+      <w:pPr>
+        <w:pBdr/>
+        <w:spacing/>
+        <w:ind/>
+        <w:jc w:val="both"/>
+        <w:rPr>
+          <w:color w:val="002060"/>
+          <w:sz w:val="36"/>
+          <w:szCs w:val="36"/>
+          <w:highlight w:val="none"/>
+          <w:u w:val="single"/>
+          <w14:ligatures w14:val="none"/>
+        </w:rPr>
+      </w:pPr>
+      <w:r>
+        <w:rPr>
+          <w:color w:val="002060"/>
+          <w:sz w:val="36"/>
+          <w:szCs w:val="36"/>
+          <w:highlight w:val="none"/>
+          <w:u w:val="single"/>
+        </w:rPr>
+        <w:t xml:space="preserve">18.01.2026</w:t>
+      </w:r>
+      <w:r>
+        <w:rPr>
+          <w:color w:val="002060"/>
+          <w:sz w:val="36"/>
+          <w:szCs w:val="36"/>
+          <w:highlight w:val="none"/>
+          <w:u w:val="single"/>
+          <w14:ligatures w14:val="none"/>
+        </w:rPr>
+      </w:r>
+      <w:r>
+        <w:rPr>
+          <w:color w:val="002060"/>
+          <w:sz w:val="36"/>
+          <w:szCs w:val="36"/>
+          <w:highlight w:val="none"/>
+          <w:u w:val="single"/>
+          <w14:ligatures w14:val="none"/>
+        </w:rPr>
+      </w:r>
+    </w:p>
+    <w:p>
+      <w:pPr>
+        <w:pStyle w:val="896"/>
+        <w:numPr>
+          <w:ilvl w:val="0"/>
+          <w:numId w:val="5"/>
+        </w:numPr>
+        <w:pBdr/>
+        <w:spacing/>
+        <w:ind/>
+        <w:jc w:val="both"/>
+        <w:rPr>
+          <w:sz w:val="32"/>
+          <w:szCs w:val="32"/>
+        </w:rPr>
+      </w:pPr>
+      <w:r>
+        <w:rPr>
+          <w:sz w:val="32"/>
+          <w:szCs w:val="32"/>
+          <w:highlight w:val="none"/>
+        </w:rPr>
+        <w:t xml:space="preserve">Adding words in runtime code in kaldi is only recommended when the word list is small. So we have to rebuild the language model with new words as we have thousands/millions of new words.</w:t>
+      </w:r>
+      <w:r>
+        <w:rPr>
+          <w:sz w:val="32"/>
+          <w:szCs w:val="32"/>
+        </w:rPr>
+      </w:r>
+    </w:p>
+    <w:p>
+      <w:pPr>
+        <w:pStyle w:val="896"/>
+        <w:numPr>
+          <w:ilvl w:val="0"/>
+          <w:numId w:val="5"/>
+        </w:numPr>
+        <w:pBdr/>
+        <w:spacing/>
+        <w:ind/>
+        <w:jc w:val="both"/>
+        <w:rPr>
+          <w:sz w:val="32"/>
+          <w:szCs w:val="32"/>
+        </w:rPr>
+      </w:pPr>
+      <w:r>
+        <w:rPr>
+          <w:sz w:val="32"/>
+          <w:szCs w:val="32"/>
+          <w:highlight w:val="none"/>
+        </w:rPr>
+        <w:t xml:space="preserve">After some search, the conclusion is that, VOSK is not recommended for a desktop assistant, but should be used where limited vocabulary is required.</w:t>
+      </w:r>
+      <w:r>
+        <w:rPr>
+          <w:sz w:val="32"/>
+          <w:szCs w:val="32"/>
+        </w:rPr>
+      </w:r>
+    </w:p>
+    <w:p>
+      <w:pPr>
+        <w:pStyle w:val="896"/>
+        <w:numPr>
+          <w:ilvl w:val="0"/>
+          <w:numId w:val="5"/>
+        </w:numPr>
+        <w:pBdr/>
+        <w:spacing/>
+        <w:ind/>
+        <w:jc w:val="both"/>
+        <w:rPr>
+          <w:sz w:val="32"/>
+          <w:szCs w:val="32"/>
+        </w:rPr>
+      </w:pPr>
+      <w:r>
+        <w:rPr>
+          <w:sz w:val="32"/>
+          <w:szCs w:val="32"/>
+          <w:highlight w:val="none"/>
+        </w:rPr>
+      </w:r>
+      <w:r>
+        <w:rPr>
+          <w:sz w:val="32"/>
+          <w:szCs w:val="32"/>
+          <w:highlight w:val="none"/>
+        </w:rPr>
+        <w:t xml:space="preserve">Deciding to shift to faster-whisper small model.</w:t>
+      </w:r>
+      <w:r>
+        <w:rPr>
+          <w:sz w:val="32"/>
+          <w:szCs w:val="32"/>
+        </w:rPr>
+      </w:r>
+    </w:p>
+    <w:p>
+      <w:pPr>
+        <w:pStyle w:val="896"/>
+        <w:numPr>
+          <w:ilvl w:val="0"/>
+          <w:numId w:val="5"/>
+        </w:numPr>
+        <w:pBdr/>
+        <w:spacing/>
+        <w:ind/>
+        <w:jc w:val="both"/>
+        <w:rPr>
+          <w:sz w:val="32"/>
+          <w:szCs w:val="32"/>
+        </w:rPr>
+      </w:pPr>
+      <w:r>
+        <w:rPr>
+          <w:sz w:val="32"/>
+          <w:szCs w:val="32"/>
+          <w:highlight w:val="none"/>
+        </w:rPr>
+        <w:t xml:space="preserve">Fast-Whisper has high latency (more than 3 sec). So, it is not reliable for real-time processing.</w:t>
+      </w:r>
+      <w:r>
+        <w:rPr>
+          <w:sz w:val="32"/>
+          <w:szCs w:val="32"/>
+        </w:rPr>
+      </w:r>
+    </w:p>
+    <w:p>
+      <w:pPr>
+        <w:pStyle w:val="896"/>
+        <w:numPr>
+          <w:ilvl w:val="0"/>
+          <w:numId w:val="5"/>
+        </w:numPr>
+        <w:pBdr/>
+        <w:spacing/>
+        <w:ind/>
+        <w:jc w:val="both"/>
+        <w:rPr>
+          <w:sz w:val="32"/>
+          <w:szCs w:val="32"/>
+        </w:rPr>
+      </w:pPr>
+      <w:r>
+        <w:rPr>
+          <w:sz w:val="32"/>
+          <w:szCs w:val="32"/>
+          <w:highlight w:val="none"/>
+        </w:rPr>
+        <w:t xml:space="preserve">Switching back to vosk </w:t>
+      </w:r>
+      <w:r>
+        <w:rPr>
+          <w:sz w:val="32"/>
+          <w:szCs w:val="32"/>
+          <w:highlight w:val="none"/>
+        </w:rPr>
+        <w:t xml:space="preserve">with a different approach. That is, adding a phonetic/fizzy recovery layer as a post-process to map the vosk inaccurate result to a word.</w:t>
+      </w:r>
+      <w:r>
+        <w:rPr>
+          <w:sz w:val="32"/>
+          <w:szCs w:val="32"/>
+          <w:highlight w:val="none"/>
         </w:rPr>
       </w:r>
     </w:p>
@@ -53,7 +422,6 @@
         <w:ind/>
         <w:rPr/>
       </w:pPr>
-      <w:r/>
       <w:r>
         <w:separator/>
       </w:r>
@@ -68,7 +436,6 @@
         <w:ind/>
         <w:rPr/>
       </w:pPr>
-      <w:r/>
       <w:r>
         <w:continuationSeparator/>
       </w:r>
@@ -88,7 +455,6 @@
         <w:ind/>
         <w:rPr/>
       </w:pPr>
-      <w:r/>
       <w:r>
         <w:separator/>
       </w:r>
@@ -103,7 +469,6 @@
         <w:ind/>
         <w:rPr/>
       </w:pPr>
-      <w:r/>
       <w:r>
         <w:continuationSeparator/>
       </w:r>
@@ -244,8 +609,536 @@
       <w:suff w:val="tab"/>
     </w:lvl>
   </w:abstractNum>
+  <w:abstractNum w:abstractNumId="1">
+    <w:nsid w:val="5B6779A4"/>
+    <w:lvl w:ilvl="0">
+      <w:isLgl w:val="false"/>
+      <w:lvlJc w:val="left"/>
+      <w:lvlText w:val="%1."/>
+      <w:numFmt w:val="decimal"/>
+      <w:pPr>
+        <w:pBdr/>
+        <w:spacing/>
+        <w:ind w:hanging="360" w:left="709"/>
+      </w:pPr>
+      <w:rPr/>
+      <w:start w:val="1"/>
+      <w:suff w:val="tab"/>
+    </w:lvl>
+    <w:lvl w:ilvl="1">
+      <w:isLgl w:val="false"/>
+      <w:lvlJc w:val="left"/>
+      <w:lvlText w:val="%2."/>
+      <w:numFmt w:val="lowerLetter"/>
+      <w:pPr>
+        <w:pBdr/>
+        <w:spacing/>
+        <w:ind w:hanging="360" w:left="1429"/>
+      </w:pPr>
+      <w:rPr/>
+      <w:start w:val="1"/>
+      <w:suff w:val="tab"/>
+    </w:lvl>
+    <w:lvl w:ilvl="2">
+      <w:isLgl w:val="false"/>
+      <w:lvlJc w:val="right"/>
+      <w:lvlText w:val="%3."/>
+      <w:numFmt w:val="lowerRoman"/>
+      <w:pPr>
+        <w:pBdr/>
+        <w:spacing/>
+        <w:ind w:hanging="180" w:left="2149"/>
+      </w:pPr>
+      <w:rPr/>
+      <w:start w:val="1"/>
+      <w:suff w:val="tab"/>
+    </w:lvl>
+    <w:lvl w:ilvl="3">
+      <w:isLgl w:val="false"/>
+      <w:lvlJc w:val="left"/>
+      <w:lvlText w:val="%4."/>
+      <w:numFmt w:val="decimal"/>
+      <w:pPr>
+        <w:pBdr/>
+        <w:spacing/>
+        <w:ind w:hanging="360" w:left="2869"/>
+      </w:pPr>
+      <w:rPr/>
+      <w:start w:val="1"/>
+      <w:suff w:val="tab"/>
+    </w:lvl>
+    <w:lvl w:ilvl="4">
+      <w:isLgl w:val="false"/>
+      <w:lvlJc w:val="left"/>
+      <w:lvlText w:val="%5."/>
+      <w:numFmt w:val="lowerLetter"/>
+      <w:pPr>
+        <w:pBdr/>
+        <w:spacing/>
+        <w:ind w:hanging="360" w:left="3589"/>
+      </w:pPr>
+      <w:rPr/>
+      <w:start w:val="1"/>
+      <w:suff w:val="tab"/>
+    </w:lvl>
+    <w:lvl w:ilvl="5">
+      <w:isLgl w:val="false"/>
+      <w:lvlJc w:val="right"/>
+      <w:lvlText w:val="%6."/>
+      <w:numFmt w:val="lowerRoman"/>
+      <w:pPr>
+        <w:pBdr/>
+        <w:spacing/>
+        <w:ind w:hanging="180" w:left="4309"/>
+      </w:pPr>
+      <w:rPr/>
+      <w:start w:val="1"/>
+      <w:suff w:val="tab"/>
+    </w:lvl>
+    <w:lvl w:ilvl="6">
+      <w:isLgl w:val="false"/>
+      <w:lvlJc w:val="left"/>
+      <w:lvlText w:val="%7."/>
+      <w:numFmt w:val="decimal"/>
+      <w:pPr>
+        <w:pBdr/>
+        <w:spacing/>
+        <w:ind w:hanging="360" w:left="5029"/>
+      </w:pPr>
+      <w:rPr/>
+      <w:start w:val="1"/>
+      <w:suff w:val="tab"/>
+    </w:lvl>
+    <w:lvl w:ilvl="7">
+      <w:isLgl w:val="false"/>
+      <w:lvlJc w:val="left"/>
+      <w:lvlText w:val="%8."/>
+      <w:numFmt w:val="lowerLetter"/>
+      <w:pPr>
+        <w:pBdr/>
+        <w:spacing/>
+        <w:ind w:hanging="360" w:left="5749"/>
+      </w:pPr>
+      <w:rPr/>
+      <w:start w:val="1"/>
+      <w:suff w:val="tab"/>
+    </w:lvl>
+    <w:lvl w:ilvl="8">
+      <w:isLgl w:val="false"/>
+      <w:lvlJc w:val="right"/>
+      <w:lvlText w:val="%9."/>
+      <w:numFmt w:val="lowerRoman"/>
+      <w:pPr>
+        <w:pBdr/>
+        <w:spacing/>
+        <w:ind w:hanging="180" w:left="6469"/>
+      </w:pPr>
+      <w:rPr/>
+      <w:start w:val="1"/>
+      <w:suff w:val="tab"/>
+    </w:lvl>
+  </w:abstractNum>
+  <w:abstractNum w:abstractNumId="2">
+    <w:nsid w:val="137E7FB1"/>
+    <w:lvl w:ilvl="0">
+      <w:isLgl w:val="false"/>
+      <w:lvlJc w:val="left"/>
+      <w:lvlText w:val="%1."/>
+      <w:numFmt w:val="decimal"/>
+      <w:pPr>
+        <w:pBdr/>
+        <w:spacing/>
+        <w:ind w:hanging="360" w:left="709"/>
+      </w:pPr>
+      <w:rPr/>
+      <w:start w:val="1"/>
+      <w:suff w:val="tab"/>
+    </w:lvl>
+    <w:lvl w:ilvl="1">
+      <w:isLgl w:val="false"/>
+      <w:lvlJc w:val="left"/>
+      <w:lvlText w:val="%2."/>
+      <w:numFmt w:val="lowerLetter"/>
+      <w:pPr>
+        <w:pBdr/>
+        <w:spacing/>
+        <w:ind w:hanging="360" w:left="1429"/>
+      </w:pPr>
+      <w:rPr/>
+      <w:start w:val="1"/>
+      <w:suff w:val="tab"/>
+    </w:lvl>
+    <w:lvl w:ilvl="2">
+      <w:isLgl w:val="false"/>
+      <w:lvlJc w:val="right"/>
+      <w:lvlText w:val="%3."/>
+      <w:numFmt w:val="lowerRoman"/>
+      <w:pPr>
+        <w:pBdr/>
+        <w:spacing/>
+        <w:ind w:hanging="180" w:left="2149"/>
+      </w:pPr>
+      <w:rPr/>
+      <w:start w:val="1"/>
+      <w:suff w:val="tab"/>
+    </w:lvl>
+    <w:lvl w:ilvl="3">
+      <w:isLgl w:val="false"/>
+      <w:lvlJc w:val="left"/>
+      <w:lvlText w:val="%4."/>
+      <w:numFmt w:val="decimal"/>
+      <w:pPr>
+        <w:pBdr/>
+        <w:spacing/>
+        <w:ind w:hanging="360" w:left="2869"/>
+      </w:pPr>
+      <w:rPr/>
+      <w:start w:val="1"/>
+      <w:suff w:val="tab"/>
+    </w:lvl>
+    <w:lvl w:ilvl="4">
+      <w:isLgl w:val="false"/>
+      <w:lvlJc w:val="left"/>
+      <w:lvlText w:val="%5."/>
+      <w:numFmt w:val="lowerLetter"/>
+      <w:pPr>
+        <w:pBdr/>
+        <w:spacing/>
+        <w:ind w:hanging="360" w:left="3589"/>
+      </w:pPr>
+      <w:rPr/>
+      <w:start w:val="1"/>
+      <w:suff w:val="tab"/>
+    </w:lvl>
+    <w:lvl w:ilvl="5">
+      <w:isLgl w:val="false"/>
+      <w:lvlJc w:val="right"/>
+      <w:lvlText w:val="%6."/>
+      <w:numFmt w:val="lowerRoman"/>
+      <w:pPr>
+        <w:pBdr/>
+        <w:spacing/>
+        <w:ind w:hanging="180" w:left="4309"/>
+      </w:pPr>
+      <w:rPr/>
+      <w:start w:val="1"/>
+      <w:suff w:val="tab"/>
+    </w:lvl>
+    <w:lvl w:ilvl="6">
+      <w:isLgl w:val="false"/>
+      <w:lvlJc w:val="left"/>
+      <w:lvlText w:val="%7."/>
+      <w:numFmt w:val="decimal"/>
+      <w:pPr>
+        <w:pBdr/>
+        <w:spacing/>
+        <w:ind w:hanging="360" w:left="5029"/>
+      </w:pPr>
+      <w:rPr/>
+      <w:start w:val="1"/>
+      <w:suff w:val="tab"/>
+    </w:lvl>
+    <w:lvl w:ilvl="7">
+      <w:isLgl w:val="false"/>
+      <w:lvlJc w:val="left"/>
+      <w:lvlText w:val="%8."/>
+      <w:numFmt w:val="lowerLetter"/>
+      <w:pPr>
+        <w:pBdr/>
+        <w:spacing/>
+        <w:ind w:hanging="360" w:left="5749"/>
+      </w:pPr>
+      <w:rPr/>
+      <w:start w:val="1"/>
+      <w:suff w:val="tab"/>
+    </w:lvl>
+    <w:lvl w:ilvl="8">
+      <w:isLgl w:val="false"/>
+      <w:lvlJc w:val="right"/>
+      <w:lvlText w:val="%9."/>
+      <w:numFmt w:val="lowerRoman"/>
+      <w:pPr>
+        <w:pBdr/>
+        <w:spacing/>
+        <w:ind w:hanging="180" w:left="6469"/>
+      </w:pPr>
+      <w:rPr/>
+      <w:start w:val="1"/>
+      <w:suff w:val="tab"/>
+    </w:lvl>
+  </w:abstractNum>
+  <w:abstractNum w:abstractNumId="3">
+    <w:nsid w:val="00F3B130"/>
+    <w:lvl w:ilvl="0">
+      <w:isLgl w:val="false"/>
+      <w:lvlJc w:val="left"/>
+      <w:lvlText w:val="%1."/>
+      <w:numFmt w:val="decimal"/>
+      <w:pPr>
+        <w:pBdr/>
+        <w:spacing/>
+        <w:ind w:hanging="360" w:left="709"/>
+      </w:pPr>
+      <w:rPr/>
+      <w:start w:val="1"/>
+      <w:suff w:val="tab"/>
+    </w:lvl>
+    <w:lvl w:ilvl="1">
+      <w:isLgl w:val="false"/>
+      <w:lvlJc w:val="left"/>
+      <w:lvlText w:val="%2."/>
+      <w:numFmt w:val="lowerLetter"/>
+      <w:pPr>
+        <w:pBdr/>
+        <w:spacing/>
+        <w:ind w:hanging="360" w:left="1429"/>
+      </w:pPr>
+      <w:rPr/>
+      <w:start w:val="1"/>
+      <w:suff w:val="tab"/>
+    </w:lvl>
+    <w:lvl w:ilvl="2">
+      <w:isLgl w:val="false"/>
+      <w:lvlJc w:val="right"/>
+      <w:lvlText w:val="%3."/>
+      <w:numFmt w:val="lowerRoman"/>
+      <w:pPr>
+        <w:pBdr/>
+        <w:spacing/>
+        <w:ind w:hanging="180" w:left="2149"/>
+      </w:pPr>
+      <w:rPr/>
+      <w:start w:val="1"/>
+      <w:suff w:val="tab"/>
+    </w:lvl>
+    <w:lvl w:ilvl="3">
+      <w:isLgl w:val="false"/>
+      <w:lvlJc w:val="left"/>
+      <w:lvlText w:val="%4."/>
+      <w:numFmt w:val="decimal"/>
+      <w:pPr>
+        <w:pBdr/>
+        <w:spacing/>
+        <w:ind w:hanging="360" w:left="2869"/>
+      </w:pPr>
+      <w:rPr/>
+      <w:start w:val="1"/>
+      <w:suff w:val="tab"/>
+    </w:lvl>
+    <w:lvl w:ilvl="4">
+      <w:isLgl w:val="false"/>
+      <w:lvlJc w:val="left"/>
+      <w:lvlText w:val="%5."/>
+      <w:numFmt w:val="lowerLetter"/>
+      <w:pPr>
+        <w:pBdr/>
+        <w:spacing/>
+        <w:ind w:hanging="360" w:left="3589"/>
+      </w:pPr>
+      <w:rPr/>
+      <w:start w:val="1"/>
+      <w:suff w:val="tab"/>
+    </w:lvl>
+    <w:lvl w:ilvl="5">
+      <w:isLgl w:val="false"/>
+      <w:lvlJc w:val="right"/>
+      <w:lvlText w:val="%6."/>
+      <w:numFmt w:val="lowerRoman"/>
+      <w:pPr>
+        <w:pBdr/>
+        <w:spacing/>
+        <w:ind w:hanging="180" w:left="4309"/>
+      </w:pPr>
+      <w:rPr/>
+      <w:start w:val="1"/>
+      <w:suff w:val="tab"/>
+    </w:lvl>
+    <w:lvl w:ilvl="6">
+      <w:isLgl w:val="false"/>
+      <w:lvlJc w:val="left"/>
+      <w:lvlText w:val="%7."/>
+      <w:numFmt w:val="decimal"/>
+      <w:pPr>
+        <w:pBdr/>
+        <w:spacing/>
+        <w:ind w:hanging="360" w:left="5029"/>
+      </w:pPr>
+      <w:rPr/>
+      <w:start w:val="1"/>
+      <w:suff w:val="tab"/>
+    </w:lvl>
+    <w:lvl w:ilvl="7">
+      <w:isLgl w:val="false"/>
+      <w:lvlJc w:val="left"/>
+      <w:lvlText w:val="%8."/>
+      <w:numFmt w:val="lowerLetter"/>
+      <w:pPr>
+        <w:pBdr/>
+        <w:spacing/>
+        <w:ind w:hanging="360" w:left="5749"/>
+      </w:pPr>
+      <w:rPr/>
+      <w:start w:val="1"/>
+      <w:suff w:val="tab"/>
+    </w:lvl>
+    <w:lvl w:ilvl="8">
+      <w:isLgl w:val="false"/>
+      <w:lvlJc w:val="right"/>
+      <w:lvlText w:val="%9."/>
+      <w:numFmt w:val="lowerRoman"/>
+      <w:pPr>
+        <w:pBdr/>
+        <w:spacing/>
+        <w:ind w:hanging="180" w:left="6469"/>
+      </w:pPr>
+      <w:rPr/>
+      <w:start w:val="1"/>
+      <w:suff w:val="tab"/>
+    </w:lvl>
+  </w:abstractNum>
+  <w:abstractNum w:abstractNumId="4">
+    <w:nsid w:val="3BC1D848"/>
+    <w:lvl w:ilvl="0">
+      <w:isLgl w:val="false"/>
+      <w:lvlJc w:val="left"/>
+      <w:lvlText w:val="%1."/>
+      <w:numFmt w:val="decimal"/>
+      <w:pPr>
+        <w:pBdr/>
+        <w:spacing/>
+        <w:ind w:hanging="360" w:left="709"/>
+      </w:pPr>
+      <w:rPr/>
+      <w:start w:val="1"/>
+      <w:suff w:val="tab"/>
+    </w:lvl>
+    <w:lvl w:ilvl="1">
+      <w:isLgl w:val="false"/>
+      <w:lvlJc w:val="left"/>
+      <w:lvlText w:val="%2."/>
+      <w:numFmt w:val="lowerLetter"/>
+      <w:pPr>
+        <w:pBdr/>
+        <w:spacing/>
+        <w:ind w:hanging="360" w:left="1429"/>
+      </w:pPr>
+      <w:rPr/>
+      <w:start w:val="1"/>
+      <w:suff w:val="tab"/>
+    </w:lvl>
+    <w:lvl w:ilvl="2">
+      <w:isLgl w:val="false"/>
+      <w:lvlJc w:val="right"/>
+      <w:lvlText w:val="%3."/>
+      <w:numFmt w:val="lowerRoman"/>
+      <w:pPr>
+        <w:pBdr/>
+        <w:spacing/>
+        <w:ind w:hanging="180" w:left="2149"/>
+      </w:pPr>
+      <w:rPr/>
+      <w:start w:val="1"/>
+      <w:suff w:val="tab"/>
+    </w:lvl>
+    <w:lvl w:ilvl="3">
+      <w:isLgl w:val="false"/>
+      <w:lvlJc w:val="left"/>
+      <w:lvlText w:val="%4."/>
+      <w:numFmt w:val="decimal"/>
+      <w:pPr>
+        <w:pBdr/>
+        <w:spacing/>
+        <w:ind w:hanging="360" w:left="2869"/>
+      </w:pPr>
+      <w:rPr/>
+      <w:start w:val="1"/>
+      <w:suff w:val="tab"/>
+    </w:lvl>
+    <w:lvl w:ilvl="4">
+      <w:isLgl w:val="false"/>
+      <w:lvlJc w:val="left"/>
+      <w:lvlText w:val="%5."/>
+      <w:numFmt w:val="lowerLetter"/>
+      <w:pPr>
+        <w:pBdr/>
+        <w:spacing/>
+        <w:ind w:hanging="360" w:left="3589"/>
+      </w:pPr>
+      <w:rPr/>
+      <w:start w:val="1"/>
+      <w:suff w:val="tab"/>
+    </w:lvl>
+    <w:lvl w:ilvl="5">
+      <w:isLgl w:val="false"/>
+      <w:lvlJc w:val="right"/>
+      <w:lvlText w:val="%6."/>
+      <w:numFmt w:val="lowerRoman"/>
+      <w:pPr>
+        <w:pBdr/>
+        <w:spacing/>
+        <w:ind w:hanging="180" w:left="4309"/>
+      </w:pPr>
+      <w:rPr/>
+      <w:start w:val="1"/>
+      <w:suff w:val="tab"/>
+    </w:lvl>
+    <w:lvl w:ilvl="6">
+      <w:isLgl w:val="false"/>
+      <w:lvlJc w:val="left"/>
+      <w:lvlText w:val="%7."/>
+      <w:numFmt w:val="decimal"/>
+      <w:pPr>
+        <w:pBdr/>
+        <w:spacing/>
+        <w:ind w:hanging="360" w:left="5029"/>
+      </w:pPr>
+      <w:rPr/>
+      <w:start w:val="1"/>
+      <w:suff w:val="tab"/>
+    </w:lvl>
+    <w:lvl w:ilvl="7">
+      <w:isLgl w:val="false"/>
+      <w:lvlJc w:val="left"/>
+      <w:lvlText w:val="%8."/>
+      <w:numFmt w:val="lowerLetter"/>
+      <w:pPr>
+        <w:pBdr/>
+        <w:spacing/>
+        <w:ind w:hanging="360" w:left="5749"/>
+      </w:pPr>
+      <w:rPr/>
+      <w:start w:val="1"/>
+      <w:suff w:val="tab"/>
+    </w:lvl>
+    <w:lvl w:ilvl="8">
+      <w:isLgl w:val="false"/>
+      <w:lvlJc w:val="right"/>
+      <w:lvlText w:val="%9."/>
+      <w:numFmt w:val="lowerRoman"/>
+      <w:pPr>
+        <w:pBdr/>
+        <w:spacing/>
+        <w:ind w:hanging="180" w:left="6469"/>
+      </w:pPr>
+      <w:rPr/>
+      <w:start w:val="1"/>
+      <w:suff w:val="tab"/>
+    </w:lvl>
+  </w:abstractNum>
   <w:num w:numId="1">
     <w:abstractNumId w:val="0"/>
+  </w:num>
+  <w:num w:numId="2">
+    <w:abstractNumId w:val="1"/>
+  </w:num>
+  <w:num w:numId="3">
+    <w:abstractNumId w:val="2"/>
+  </w:num>
+  <w:num w:numId="4">
+    <w:abstractNumId w:val="3"/>
+  </w:num>
+  <w:num w:numId="5">
+    <w:abstractNumId w:val="4"/>
   </w:num>
 </w:numbering>
 </file>
@@ -408,9 +1301,9 @@
     <w:lsdException w:name="Bibliography" w:uiPriority="37"/>
     <w:lsdException w:name="TOC Heading" w:uiPriority="39" w:qFormat="1"/>
   </w:latentStyles>
-  <w:style w:type="table" w:styleId="12">
+  <w:style w:type="table" w:styleId="707">
     <w:name w:val="Table Grid"/>
-    <w:basedOn w:val="665"/>
+    <w:basedOn w:val="893"/>
     <w:uiPriority w:val="59"/>
     <w:pPr>
       <w:pBdr/>
@@ -607,9 +1500,9 @@
       </w:tcPr>
     </w:tblStylePr>
   </w:style>
-  <w:style w:type="table" w:styleId="13">
+  <w:style w:type="table" w:styleId="708">
     <w:name w:val="Table Grid Light"/>
-    <w:basedOn w:val="665"/>
+    <w:basedOn w:val="893"/>
     <w:uiPriority w:val="59"/>
     <w:pPr>
       <w:pBdr/>
@@ -806,9 +1699,9 @@
       </w:tcPr>
     </w:tblStylePr>
   </w:style>
-  <w:style w:type="table" w:styleId="14">
+  <w:style w:type="table" w:styleId="709">
     <w:name w:val="Plain Table 1"/>
-    <w:basedOn w:val="665"/>
+    <w:basedOn w:val="893"/>
     <w:uiPriority w:val="59"/>
     <w:pPr>
       <w:pBdr/>
@@ -1031,9 +1924,9 @@
       </w:tcPr>
     </w:tblStylePr>
   </w:style>
-  <w:style w:type="table" w:styleId="15">
+  <w:style w:type="table" w:styleId="710">
     <w:name w:val="Plain Table 2"/>
-    <w:basedOn w:val="665"/>
+    <w:basedOn w:val="893"/>
     <w:uiPriority w:val="59"/>
     <w:pPr>
       <w:pBdr/>
@@ -1264,9 +2157,9 @@
       </w:tcPr>
     </w:tblStylePr>
   </w:style>
-  <w:style w:type="table" w:styleId="16">
+  <w:style w:type="table" w:styleId="711">
     <w:name w:val="Plain Table 3"/>
-    <w:basedOn w:val="665"/>
+    <w:basedOn w:val="893"/>
     <w:uiPriority w:val="99"/>
     <w:pPr>
       <w:pBdr/>
@@ -1494,9 +2387,9 @@
       </w:tcPr>
     </w:tblStylePr>
   </w:style>
-  <w:style w:type="table" w:styleId="17">
+  <w:style w:type="table" w:styleId="712">
     <w:name w:val="Plain Table 4"/>
-    <w:basedOn w:val="665"/>
+    <w:basedOn w:val="893"/>
     <w:uiPriority w:val="99"/>
     <w:pPr>
       <w:pBdr/>
@@ -1710,9 +2603,9 @@
       </w:tcPr>
     </w:tblStylePr>
   </w:style>
-  <w:style w:type="table" w:styleId="18">
+  <w:style w:type="table" w:styleId="713">
     <w:name w:val="Plain Table 5"/>
-    <w:basedOn w:val="665"/>
+    <w:basedOn w:val="893"/>
     <w:uiPriority w:val="99"/>
     <w:pPr>
       <w:pBdr/>
@@ -1943,9 +2836,9 @@
       </w:tcPr>
     </w:tblStylePr>
   </w:style>
-  <w:style w:type="table" w:styleId="19">
+  <w:style w:type="table" w:styleId="714">
     <w:name w:val="Grid Table 1 Light"/>
-    <w:basedOn w:val="665"/>
+    <w:basedOn w:val="893"/>
     <w:uiPriority w:val="99"/>
     <w:pPr>
       <w:pBdr/>
@@ -2166,9 +3059,9 @@
       </w:tcPr>
     </w:tblStylePr>
   </w:style>
-  <w:style w:type="table" w:styleId="20">
+  <w:style w:type="table" w:styleId="715">
     <w:name w:val="Grid Table 1 Light - Accent 1"/>
-    <w:basedOn w:val="665"/>
+    <w:basedOn w:val="893"/>
     <w:uiPriority w:val="99"/>
     <w:pPr>
       <w:pBdr/>
@@ -2389,9 +3282,9 @@
       </w:tcPr>
     </w:tblStylePr>
   </w:style>
-  <w:style w:type="table" w:styleId="21">
+  <w:style w:type="table" w:styleId="716">
     <w:name w:val="Grid Table 1 Light - Accent 2"/>
-    <w:basedOn w:val="665"/>
+    <w:basedOn w:val="893"/>
     <w:uiPriority w:val="99"/>
     <w:pPr>
       <w:pBdr/>
@@ -2612,9 +3505,9 @@
       </w:tcPr>
     </w:tblStylePr>
   </w:style>
-  <w:style w:type="table" w:styleId="22">
+  <w:style w:type="table" w:styleId="717">
     <w:name w:val="Grid Table 1 Light - Accent 3"/>
-    <w:basedOn w:val="665"/>
+    <w:basedOn w:val="893"/>
     <w:uiPriority w:val="99"/>
     <w:pPr>
       <w:pBdr/>
@@ -2835,9 +3728,9 @@
       </w:tcPr>
     </w:tblStylePr>
   </w:style>
-  <w:style w:type="table" w:styleId="23">
+  <w:style w:type="table" w:styleId="718">
     <w:name w:val="Grid Table 1 Light - Accent 4"/>
-    <w:basedOn w:val="665"/>
+    <w:basedOn w:val="893"/>
     <w:uiPriority w:val="99"/>
     <w:pPr>
       <w:pBdr/>
@@ -3058,9 +3951,9 @@
       </w:tcPr>
     </w:tblStylePr>
   </w:style>
-  <w:style w:type="table" w:styleId="24">
+  <w:style w:type="table" w:styleId="719">
     <w:name w:val="Grid Table 1 Light - Accent 5"/>
-    <w:basedOn w:val="665"/>
+    <w:basedOn w:val="893"/>
     <w:uiPriority w:val="99"/>
     <w:pPr>
       <w:pBdr/>
@@ -3281,9 +4174,9 @@
       </w:tcPr>
     </w:tblStylePr>
   </w:style>
-  <w:style w:type="table" w:styleId="25">
+  <w:style w:type="table" w:styleId="720">
     <w:name w:val="Grid Table 1 Light - Accent 6"/>
-    <w:basedOn w:val="665"/>
+    <w:basedOn w:val="893"/>
     <w:uiPriority w:val="99"/>
     <w:pPr>
       <w:pBdr/>
@@ -3504,9 +4397,9 @@
       </w:tcPr>
     </w:tblStylePr>
   </w:style>
-  <w:style w:type="table" w:styleId="26">
+  <w:style w:type="table" w:styleId="721">
     <w:name w:val="Grid Table 2"/>
-    <w:basedOn w:val="665"/>
+    <w:basedOn w:val="893"/>
     <w:uiPriority w:val="99"/>
     <w:pPr>
       <w:pBdr/>
@@ -3736,9 +4629,9 @@
       </w:tcPr>
     </w:tblStylePr>
   </w:style>
-  <w:style w:type="table" w:styleId="27">
+  <w:style w:type="table" w:styleId="722">
     <w:name w:val="Grid Table 2 - Accent 1"/>
-    <w:basedOn w:val="665"/>
+    <w:basedOn w:val="893"/>
     <w:uiPriority w:val="99"/>
     <w:pPr>
       <w:pBdr/>
@@ -3968,9 +4861,9 @@
       </w:tcPr>
     </w:tblStylePr>
   </w:style>
-  <w:style w:type="table" w:styleId="28">
+  <w:style w:type="table" w:styleId="723">
     <w:name w:val="Grid Table 2 - Accent 2"/>
-    <w:basedOn w:val="665"/>
+    <w:basedOn w:val="893"/>
     <w:uiPriority w:val="99"/>
     <w:pPr>
       <w:pBdr/>
@@ -4200,9 +5093,9 @@
       </w:tcPr>
     </w:tblStylePr>
   </w:style>
-  <w:style w:type="table" w:styleId="29">
+  <w:style w:type="table" w:styleId="724">
     <w:name w:val="Grid Table 2 - Accent 3"/>
-    <w:basedOn w:val="665"/>
+    <w:basedOn w:val="893"/>
     <w:uiPriority w:val="99"/>
     <w:pPr>
       <w:pBdr/>
@@ -4432,9 +5325,9 @@
       </w:tcPr>
     </w:tblStylePr>
   </w:style>
-  <w:style w:type="table" w:styleId="30">
+  <w:style w:type="table" w:styleId="725">
     <w:name w:val="Grid Table 2 - Accent 4"/>
-    <w:basedOn w:val="665"/>
+    <w:basedOn w:val="893"/>
     <w:uiPriority w:val="99"/>
     <w:pPr>
       <w:pBdr/>
@@ -4664,9 +5557,9 @@
       </w:tcPr>
     </w:tblStylePr>
   </w:style>
-  <w:style w:type="table" w:styleId="31">
+  <w:style w:type="table" w:styleId="726">
     <w:name w:val="Grid Table 2 - Accent 5"/>
-    <w:basedOn w:val="665"/>
+    <w:basedOn w:val="893"/>
     <w:uiPriority w:val="99"/>
     <w:pPr>
       <w:pBdr/>
@@ -4896,9 +5789,9 @@
       </w:tcPr>
     </w:tblStylePr>
   </w:style>
-  <w:style w:type="table" w:styleId="32">
+  <w:style w:type="table" w:styleId="727">
     <w:name w:val="Grid Table 2 - Accent 6"/>
-    <w:basedOn w:val="665"/>
+    <w:basedOn w:val="893"/>
     <w:uiPriority w:val="99"/>
     <w:pPr>
       <w:pBdr/>
@@ -5128,9 +6021,9 @@
       </w:tcPr>
     </w:tblStylePr>
   </w:style>
-  <w:style w:type="table" w:styleId="33">
+  <w:style w:type="table" w:styleId="728">
     <w:name w:val="Grid Table 3"/>
-    <w:basedOn w:val="665"/>
+    <w:basedOn w:val="893"/>
     <w:uiPriority w:val="99"/>
     <w:pPr>
       <w:pBdr/>
@@ -5229,29 +6122,6 @@
         <w:tblBorders/>
       </w:tblPr>
       <w:tcPr>
-        <w:shd w:color="ffffff"/>
-        <w:tcBorders>
-          <w:top w:val="none" w:color="000000" w:sz="4" w:space="0"/>
-          <w:left w:val="none" w:color="000000" w:sz="4" w:space="0"/>
-          <w:bottom w:val="none" w:color="000000" w:sz="4" w:space="0"/>
-          <w:right w:val="none" w:color="000000" w:sz="4" w:space="0"/>
-        </w:tcBorders>
-      </w:tcPr>
-    </w:tblStylePr>
-    <w:tblStylePr w:type="firstRow">
-      <w:rPr>
-        <w:b/>
-        <w:color w:val="404040"/>
-      </w:rPr>
-      <w:pPr>
-        <w:pBdr/>
-        <w:spacing/>
-        <w:ind/>
-      </w:pPr>
-      <w:tblPr>
-        <w:tblBorders/>
-      </w:tblPr>
-      <w:tcPr>
         <w:shd w:val="clear" w:color="ffffff"/>
         <w:tcBorders>
           <w:top w:val="none" w:color="000000" w:sz="4" w:space="0"/>
@@ -5261,30 +6131,7 @@
         </w:tcBorders>
       </w:tcPr>
     </w:tblStylePr>
-    <w:tblStylePr w:type="lastCol">
-      <w:rPr>
-        <w:i/>
-        <w:color w:val="404040"/>
-      </w:rPr>
-      <w:pPr>
-        <w:pBdr/>
-        <w:spacing/>
-        <w:ind/>
-      </w:pPr>
-      <w:tblPr>
-        <w:tblBorders/>
-      </w:tblPr>
-      <w:tcPr>
-        <w:shd w:color="ffffff"/>
-        <w:tcBorders>
-          <w:top w:val="none" w:color="000000" w:sz="4" w:space="0"/>
-          <w:left w:val="none" w:color="000000" w:sz="4" w:space="0"/>
-          <w:bottom w:val="none" w:color="000000" w:sz="4" w:space="0"/>
-          <w:right w:val="none" w:color="000000" w:sz="4" w:space="0"/>
-        </w:tcBorders>
-      </w:tcPr>
-    </w:tblStylePr>
-    <w:tblStylePr w:type="lastRow">
+    <w:tblStylePr w:type="firstRow">
       <w:rPr>
         <w:b/>
         <w:color w:val="404040"/>
@@ -5307,6 +6154,52 @@
         </w:tcBorders>
       </w:tcPr>
     </w:tblStylePr>
+    <w:tblStylePr w:type="lastCol">
+      <w:rPr>
+        <w:i/>
+        <w:color w:val="404040"/>
+      </w:rPr>
+      <w:pPr>
+        <w:pBdr/>
+        <w:spacing/>
+        <w:ind/>
+      </w:pPr>
+      <w:tblPr>
+        <w:tblBorders/>
+      </w:tblPr>
+      <w:tcPr>
+        <w:shd w:val="clear" w:color="ffffff"/>
+        <w:tcBorders>
+          <w:top w:val="none" w:color="000000" w:sz="4" w:space="0"/>
+          <w:left w:val="none" w:color="000000" w:sz="4" w:space="0"/>
+          <w:bottom w:val="none" w:color="000000" w:sz="4" w:space="0"/>
+          <w:right w:val="none" w:color="000000" w:sz="4" w:space="0"/>
+        </w:tcBorders>
+      </w:tcPr>
+    </w:tblStylePr>
+    <w:tblStylePr w:type="lastRow">
+      <w:rPr>
+        <w:b/>
+        <w:color w:val="404040"/>
+      </w:rPr>
+      <w:pPr>
+        <w:pBdr/>
+        <w:spacing/>
+        <w:ind/>
+      </w:pPr>
+      <w:tblPr>
+        <w:tblBorders/>
+      </w:tblPr>
+      <w:tcPr>
+        <w:shd w:val="clear" w:color="ffffff"/>
+        <w:tcBorders>
+          <w:top w:val="none" w:color="000000" w:sz="4" w:space="0"/>
+          <w:left w:val="none" w:color="000000" w:sz="4" w:space="0"/>
+          <w:bottom w:val="none" w:color="000000" w:sz="4" w:space="0"/>
+          <w:right w:val="none" w:color="000000" w:sz="4" w:space="0"/>
+        </w:tcBorders>
+      </w:tcPr>
+    </w:tblStylePr>
     <w:tblStylePr w:type="nwCell">
       <w:pPr>
         <w:pBdr/>
@@ -5373,9 +6266,9 @@
       </w:tcPr>
     </w:tblStylePr>
   </w:style>
-  <w:style w:type="table" w:styleId="34">
+  <w:style w:type="table" w:styleId="729">
     <w:name w:val="Grid Table 3 - Accent 1"/>
-    <w:basedOn w:val="665"/>
+    <w:basedOn w:val="893"/>
     <w:uiPriority w:val="99"/>
     <w:pPr>
       <w:pBdr/>
@@ -5474,29 +6367,6 @@
         <w:tblBorders/>
       </w:tblPr>
       <w:tcPr>
-        <w:shd w:color="ffffff"/>
-        <w:tcBorders>
-          <w:top w:val="none" w:color="000000" w:sz="4" w:space="0"/>
-          <w:left w:val="none" w:color="000000" w:sz="4" w:space="0"/>
-          <w:bottom w:val="none" w:color="000000" w:sz="4" w:space="0"/>
-          <w:right w:val="none" w:color="000000" w:sz="4" w:space="0"/>
-        </w:tcBorders>
-      </w:tcPr>
-    </w:tblStylePr>
-    <w:tblStylePr w:type="firstRow">
-      <w:rPr>
-        <w:b/>
-        <w:color w:val="404040"/>
-      </w:rPr>
-      <w:pPr>
-        <w:pBdr/>
-        <w:spacing/>
-        <w:ind/>
-      </w:pPr>
-      <w:tblPr>
-        <w:tblBorders/>
-      </w:tblPr>
-      <w:tcPr>
         <w:shd w:val="clear" w:color="ffffff"/>
         <w:tcBorders>
           <w:top w:val="none" w:color="000000" w:sz="4" w:space="0"/>
@@ -5506,30 +6376,7 @@
         </w:tcBorders>
       </w:tcPr>
     </w:tblStylePr>
-    <w:tblStylePr w:type="lastCol">
-      <w:rPr>
-        <w:i/>
-        <w:color w:val="404040"/>
-      </w:rPr>
-      <w:pPr>
-        <w:pBdr/>
-        <w:spacing/>
-        <w:ind/>
-      </w:pPr>
-      <w:tblPr>
-        <w:tblBorders/>
-      </w:tblPr>
-      <w:tcPr>
-        <w:shd w:color="ffffff"/>
-        <w:tcBorders>
-          <w:top w:val="none" w:color="000000" w:sz="4" w:space="0"/>
-          <w:left w:val="none" w:color="000000" w:sz="4" w:space="0"/>
-          <w:bottom w:val="none" w:color="000000" w:sz="4" w:space="0"/>
-          <w:right w:val="none" w:color="000000" w:sz="4" w:space="0"/>
-        </w:tcBorders>
-      </w:tcPr>
-    </w:tblStylePr>
-    <w:tblStylePr w:type="lastRow">
+    <w:tblStylePr w:type="firstRow">
       <w:rPr>
         <w:b/>
         <w:color w:val="404040"/>
@@ -5552,6 +6399,52 @@
         </w:tcBorders>
       </w:tcPr>
     </w:tblStylePr>
+    <w:tblStylePr w:type="lastCol">
+      <w:rPr>
+        <w:i/>
+        <w:color w:val="404040"/>
+      </w:rPr>
+      <w:pPr>
+        <w:pBdr/>
+        <w:spacing/>
+        <w:ind/>
+      </w:pPr>
+      <w:tblPr>
+        <w:tblBorders/>
+      </w:tblPr>
+      <w:tcPr>
+        <w:shd w:val="clear" w:color="ffffff"/>
+        <w:tcBorders>
+          <w:top w:val="none" w:color="000000" w:sz="4" w:space="0"/>
+          <w:left w:val="none" w:color="000000" w:sz="4" w:space="0"/>
+          <w:bottom w:val="none" w:color="000000" w:sz="4" w:space="0"/>
+          <w:right w:val="none" w:color="000000" w:sz="4" w:space="0"/>
+        </w:tcBorders>
+      </w:tcPr>
+    </w:tblStylePr>
+    <w:tblStylePr w:type="lastRow">
+      <w:rPr>
+        <w:b/>
+        <w:color w:val="404040"/>
+      </w:rPr>
+      <w:pPr>
+        <w:pBdr/>
+        <w:spacing/>
+        <w:ind/>
+      </w:pPr>
+      <w:tblPr>
+        <w:tblBorders/>
+      </w:tblPr>
+      <w:tcPr>
+        <w:shd w:val="clear" w:color="ffffff"/>
+        <w:tcBorders>
+          <w:top w:val="none" w:color="000000" w:sz="4" w:space="0"/>
+          <w:left w:val="none" w:color="000000" w:sz="4" w:space="0"/>
+          <w:bottom w:val="none" w:color="000000" w:sz="4" w:space="0"/>
+          <w:right w:val="none" w:color="000000" w:sz="4" w:space="0"/>
+        </w:tcBorders>
+      </w:tcPr>
+    </w:tblStylePr>
     <w:tblStylePr w:type="nwCell">
       <w:pPr>
         <w:pBdr/>
@@ -5618,9 +6511,9 @@
       </w:tcPr>
     </w:tblStylePr>
   </w:style>
-  <w:style w:type="table" w:styleId="35">
+  <w:style w:type="table" w:styleId="730">
     <w:name w:val="Grid Table 3 - Accent 2"/>
-    <w:basedOn w:val="665"/>
+    <w:basedOn w:val="893"/>
     <w:uiPriority w:val="99"/>
     <w:pPr>
       <w:pBdr/>
@@ -5719,29 +6612,6 @@
         <w:tblBorders/>
       </w:tblPr>
       <w:tcPr>
-        <w:shd w:color="ffffff"/>
-        <w:tcBorders>
-          <w:top w:val="none" w:color="000000" w:sz="4" w:space="0"/>
-          <w:left w:val="none" w:color="000000" w:sz="4" w:space="0"/>
-          <w:bottom w:val="none" w:color="000000" w:sz="4" w:space="0"/>
-          <w:right w:val="none" w:color="000000" w:sz="4" w:space="0"/>
-        </w:tcBorders>
-      </w:tcPr>
-    </w:tblStylePr>
-    <w:tblStylePr w:type="firstRow">
-      <w:rPr>
-        <w:b/>
-        <w:color w:val="404040"/>
-      </w:rPr>
-      <w:pPr>
-        <w:pBdr/>
-        <w:spacing/>
-        <w:ind/>
-      </w:pPr>
-      <w:tblPr>
-        <w:tblBorders/>
-      </w:tblPr>
-      <w:tcPr>
         <w:shd w:val="clear" w:color="ffffff"/>
         <w:tcBorders>
           <w:top w:val="none" w:color="000000" w:sz="4" w:space="0"/>
@@ -5751,30 +6621,7 @@
         </w:tcBorders>
       </w:tcPr>
     </w:tblStylePr>
-    <w:tblStylePr w:type="lastCol">
-      <w:rPr>
-        <w:i/>
-        <w:color w:val="404040"/>
-      </w:rPr>
-      <w:pPr>
-        <w:pBdr/>
-        <w:spacing/>
-        <w:ind/>
-      </w:pPr>
-      <w:tblPr>
-        <w:tblBorders/>
-      </w:tblPr>
-      <w:tcPr>
-        <w:shd w:color="ffffff"/>
-        <w:tcBorders>
-          <w:top w:val="none" w:color="000000" w:sz="4" w:space="0"/>
-          <w:left w:val="none" w:color="000000" w:sz="4" w:space="0"/>
-          <w:bottom w:val="none" w:color="000000" w:sz="4" w:space="0"/>
-          <w:right w:val="none" w:color="000000" w:sz="4" w:space="0"/>
-        </w:tcBorders>
-      </w:tcPr>
-    </w:tblStylePr>
-    <w:tblStylePr w:type="lastRow">
+    <w:tblStylePr w:type="firstRow">
       <w:rPr>
         <w:b/>
         <w:color w:val="404040"/>
@@ -5797,6 +6644,52 @@
         </w:tcBorders>
       </w:tcPr>
     </w:tblStylePr>
+    <w:tblStylePr w:type="lastCol">
+      <w:rPr>
+        <w:i/>
+        <w:color w:val="404040"/>
+      </w:rPr>
+      <w:pPr>
+        <w:pBdr/>
+        <w:spacing/>
+        <w:ind/>
+      </w:pPr>
+      <w:tblPr>
+        <w:tblBorders/>
+      </w:tblPr>
+      <w:tcPr>
+        <w:shd w:val="clear" w:color="ffffff"/>
+        <w:tcBorders>
+          <w:top w:val="none" w:color="000000" w:sz="4" w:space="0"/>
+          <w:left w:val="none" w:color="000000" w:sz="4" w:space="0"/>
+          <w:bottom w:val="none" w:color="000000" w:sz="4" w:space="0"/>
+          <w:right w:val="none" w:color="000000" w:sz="4" w:space="0"/>
+        </w:tcBorders>
+      </w:tcPr>
+    </w:tblStylePr>
+    <w:tblStylePr w:type="lastRow">
+      <w:rPr>
+        <w:b/>
+        <w:color w:val="404040"/>
+      </w:rPr>
+      <w:pPr>
+        <w:pBdr/>
+        <w:spacing/>
+        <w:ind/>
+      </w:pPr>
+      <w:tblPr>
+        <w:tblBorders/>
+      </w:tblPr>
+      <w:tcPr>
+        <w:shd w:val="clear" w:color="ffffff"/>
+        <w:tcBorders>
+          <w:top w:val="none" w:color="000000" w:sz="4" w:space="0"/>
+          <w:left w:val="none" w:color="000000" w:sz="4" w:space="0"/>
+          <w:bottom w:val="none" w:color="000000" w:sz="4" w:space="0"/>
+          <w:right w:val="none" w:color="000000" w:sz="4" w:space="0"/>
+        </w:tcBorders>
+      </w:tcPr>
+    </w:tblStylePr>
     <w:tblStylePr w:type="nwCell">
       <w:pPr>
         <w:pBdr/>
@@ -5863,9 +6756,9 @@
       </w:tcPr>
     </w:tblStylePr>
   </w:style>
-  <w:style w:type="table" w:styleId="36">
+  <w:style w:type="table" w:styleId="731">
     <w:name w:val="Grid Table 3 - Accent 3"/>
-    <w:basedOn w:val="665"/>
+    <w:basedOn w:val="893"/>
     <w:uiPriority w:val="99"/>
     <w:pPr>
       <w:pBdr/>
@@ -5964,29 +6857,6 @@
         <w:tblBorders/>
       </w:tblPr>
       <w:tcPr>
-        <w:shd w:color="ffffff"/>
-        <w:tcBorders>
-          <w:top w:val="none" w:color="000000" w:sz="4" w:space="0"/>
-          <w:left w:val="none" w:color="000000" w:sz="4" w:space="0"/>
-          <w:bottom w:val="none" w:color="000000" w:sz="4" w:space="0"/>
-          <w:right w:val="none" w:color="000000" w:sz="4" w:space="0"/>
-        </w:tcBorders>
-      </w:tcPr>
-    </w:tblStylePr>
-    <w:tblStylePr w:type="firstRow">
-      <w:rPr>
-        <w:b/>
-        <w:color w:val="404040"/>
-      </w:rPr>
-      <w:pPr>
-        <w:pBdr/>
-        <w:spacing/>
-        <w:ind/>
-      </w:pPr>
-      <w:tblPr>
-        <w:tblBorders/>
-      </w:tblPr>
-      <w:tcPr>
         <w:shd w:val="clear" w:color="ffffff"/>
         <w:tcBorders>
           <w:top w:val="none" w:color="000000" w:sz="4" w:space="0"/>
@@ -5996,30 +6866,7 @@
         </w:tcBorders>
       </w:tcPr>
     </w:tblStylePr>
-    <w:tblStylePr w:type="lastCol">
-      <w:rPr>
-        <w:i/>
-        <w:color w:val="404040"/>
-      </w:rPr>
-      <w:pPr>
-        <w:pBdr/>
-        <w:spacing/>
-        <w:ind/>
-      </w:pPr>
-      <w:tblPr>
-        <w:tblBorders/>
-      </w:tblPr>
-      <w:tcPr>
-        <w:shd w:color="ffffff"/>
-        <w:tcBorders>
-          <w:top w:val="none" w:color="000000" w:sz="4" w:space="0"/>
-          <w:left w:val="none" w:color="000000" w:sz="4" w:space="0"/>
-          <w:bottom w:val="none" w:color="000000" w:sz="4" w:space="0"/>
-          <w:right w:val="none" w:color="000000" w:sz="4" w:space="0"/>
-        </w:tcBorders>
-      </w:tcPr>
-    </w:tblStylePr>
-    <w:tblStylePr w:type="lastRow">
+    <w:tblStylePr w:type="firstRow">
       <w:rPr>
         <w:b/>
         <w:color w:val="404040"/>
@@ -6042,6 +6889,52 @@
         </w:tcBorders>
       </w:tcPr>
     </w:tblStylePr>
+    <w:tblStylePr w:type="lastCol">
+      <w:rPr>
+        <w:i/>
+        <w:color w:val="404040"/>
+      </w:rPr>
+      <w:pPr>
+        <w:pBdr/>
+        <w:spacing/>
+        <w:ind/>
+      </w:pPr>
+      <w:tblPr>
+        <w:tblBorders/>
+      </w:tblPr>
+      <w:tcPr>
+        <w:shd w:val="clear" w:color="ffffff"/>
+        <w:tcBorders>
+          <w:top w:val="none" w:color="000000" w:sz="4" w:space="0"/>
+          <w:left w:val="none" w:color="000000" w:sz="4" w:space="0"/>
+          <w:bottom w:val="none" w:color="000000" w:sz="4" w:space="0"/>
+          <w:right w:val="none" w:color="000000" w:sz="4" w:space="0"/>
+        </w:tcBorders>
+      </w:tcPr>
+    </w:tblStylePr>
+    <w:tblStylePr w:type="lastRow">
+      <w:rPr>
+        <w:b/>
+        <w:color w:val="404040"/>
+      </w:rPr>
+      <w:pPr>
+        <w:pBdr/>
+        <w:spacing/>
+        <w:ind/>
+      </w:pPr>
+      <w:tblPr>
+        <w:tblBorders/>
+      </w:tblPr>
+      <w:tcPr>
+        <w:shd w:val="clear" w:color="ffffff"/>
+        <w:tcBorders>
+          <w:top w:val="none" w:color="000000" w:sz="4" w:space="0"/>
+          <w:left w:val="none" w:color="000000" w:sz="4" w:space="0"/>
+          <w:bottom w:val="none" w:color="000000" w:sz="4" w:space="0"/>
+          <w:right w:val="none" w:color="000000" w:sz="4" w:space="0"/>
+        </w:tcBorders>
+      </w:tcPr>
+    </w:tblStylePr>
     <w:tblStylePr w:type="nwCell">
       <w:pPr>
         <w:pBdr/>
@@ -6108,9 +7001,9 @@
       </w:tcPr>
     </w:tblStylePr>
   </w:style>
-  <w:style w:type="table" w:styleId="37">
+  <w:style w:type="table" w:styleId="732">
     <w:name w:val="Grid Table 3 - Accent 4"/>
-    <w:basedOn w:val="665"/>
+    <w:basedOn w:val="893"/>
     <w:uiPriority w:val="99"/>
     <w:pPr>
       <w:pBdr/>
@@ -6209,29 +7102,6 @@
         <w:tblBorders/>
       </w:tblPr>
       <w:tcPr>
-        <w:shd w:color="ffffff"/>
-        <w:tcBorders>
-          <w:top w:val="none" w:color="000000" w:sz="4" w:space="0"/>
-          <w:left w:val="none" w:color="000000" w:sz="4" w:space="0"/>
-          <w:bottom w:val="none" w:color="000000" w:sz="4" w:space="0"/>
-          <w:right w:val="none" w:color="000000" w:sz="4" w:space="0"/>
-        </w:tcBorders>
-      </w:tcPr>
-    </w:tblStylePr>
-    <w:tblStylePr w:type="firstRow">
-      <w:rPr>
-        <w:b/>
-        <w:color w:val="404040"/>
-      </w:rPr>
-      <w:pPr>
-        <w:pBdr/>
-        <w:spacing/>
-        <w:ind/>
-      </w:pPr>
-      <w:tblPr>
-        <w:tblBorders/>
-      </w:tblPr>
-      <w:tcPr>
         <w:shd w:val="clear" w:color="ffffff"/>
         <w:tcBorders>
           <w:top w:val="none" w:color="000000" w:sz="4" w:space="0"/>
@@ -6241,30 +7111,7 @@
         </w:tcBorders>
       </w:tcPr>
     </w:tblStylePr>
-    <w:tblStylePr w:type="lastCol">
-      <w:rPr>
-        <w:i/>
-        <w:color w:val="404040"/>
-      </w:rPr>
-      <w:pPr>
-        <w:pBdr/>
-        <w:spacing/>
-        <w:ind/>
-      </w:pPr>
-      <w:tblPr>
-        <w:tblBorders/>
-      </w:tblPr>
-      <w:tcPr>
-        <w:shd w:color="ffffff"/>
-        <w:tcBorders>
-          <w:top w:val="none" w:color="000000" w:sz="4" w:space="0"/>
-          <w:left w:val="none" w:color="000000" w:sz="4" w:space="0"/>
-          <w:bottom w:val="none" w:color="000000" w:sz="4" w:space="0"/>
-          <w:right w:val="none" w:color="000000" w:sz="4" w:space="0"/>
-        </w:tcBorders>
-      </w:tcPr>
-    </w:tblStylePr>
-    <w:tblStylePr w:type="lastRow">
+    <w:tblStylePr w:type="firstRow">
       <w:rPr>
         <w:b/>
         <w:color w:val="404040"/>
@@ -6287,6 +7134,52 @@
         </w:tcBorders>
       </w:tcPr>
     </w:tblStylePr>
+    <w:tblStylePr w:type="lastCol">
+      <w:rPr>
+        <w:i/>
+        <w:color w:val="404040"/>
+      </w:rPr>
+      <w:pPr>
+        <w:pBdr/>
+        <w:spacing/>
+        <w:ind/>
+      </w:pPr>
+      <w:tblPr>
+        <w:tblBorders/>
+      </w:tblPr>
+      <w:tcPr>
+        <w:shd w:val="clear" w:color="ffffff"/>
+        <w:tcBorders>
+          <w:top w:val="none" w:color="000000" w:sz="4" w:space="0"/>
+          <w:left w:val="none" w:color="000000" w:sz="4" w:space="0"/>
+          <w:bottom w:val="none" w:color="000000" w:sz="4" w:space="0"/>
+          <w:right w:val="none" w:color="000000" w:sz="4" w:space="0"/>
+        </w:tcBorders>
+      </w:tcPr>
+    </w:tblStylePr>
+    <w:tblStylePr w:type="lastRow">
+      <w:rPr>
+        <w:b/>
+        <w:color w:val="404040"/>
+      </w:rPr>
+      <w:pPr>
+        <w:pBdr/>
+        <w:spacing/>
+        <w:ind/>
+      </w:pPr>
+      <w:tblPr>
+        <w:tblBorders/>
+      </w:tblPr>
+      <w:tcPr>
+        <w:shd w:val="clear" w:color="ffffff"/>
+        <w:tcBorders>
+          <w:top w:val="none" w:color="000000" w:sz="4" w:space="0"/>
+          <w:left w:val="none" w:color="000000" w:sz="4" w:space="0"/>
+          <w:bottom w:val="none" w:color="000000" w:sz="4" w:space="0"/>
+          <w:right w:val="none" w:color="000000" w:sz="4" w:space="0"/>
+        </w:tcBorders>
+      </w:tcPr>
+    </w:tblStylePr>
     <w:tblStylePr w:type="nwCell">
       <w:pPr>
         <w:pBdr/>
@@ -6353,9 +7246,9 @@
       </w:tcPr>
     </w:tblStylePr>
   </w:style>
-  <w:style w:type="table" w:styleId="38">
+  <w:style w:type="table" w:styleId="733">
     <w:name w:val="Grid Table 3 - Accent 5"/>
-    <w:basedOn w:val="665"/>
+    <w:basedOn w:val="893"/>
     <w:uiPriority w:val="99"/>
     <w:pPr>
       <w:pBdr/>
@@ -6454,29 +7347,6 @@
         <w:tblBorders/>
       </w:tblPr>
       <w:tcPr>
-        <w:shd w:color="ffffff"/>
-        <w:tcBorders>
-          <w:top w:val="none" w:color="000000" w:sz="4" w:space="0"/>
-          <w:left w:val="none" w:color="000000" w:sz="4" w:space="0"/>
-          <w:bottom w:val="none" w:color="000000" w:sz="4" w:space="0"/>
-          <w:right w:val="none" w:color="000000" w:sz="4" w:space="0"/>
-        </w:tcBorders>
-      </w:tcPr>
-    </w:tblStylePr>
-    <w:tblStylePr w:type="firstRow">
-      <w:rPr>
-        <w:b/>
-        <w:color w:val="404040"/>
-      </w:rPr>
-      <w:pPr>
-        <w:pBdr/>
-        <w:spacing/>
-        <w:ind/>
-      </w:pPr>
-      <w:tblPr>
-        <w:tblBorders/>
-      </w:tblPr>
-      <w:tcPr>
         <w:shd w:val="clear" w:color="ffffff"/>
         <w:tcBorders>
           <w:top w:val="none" w:color="000000" w:sz="4" w:space="0"/>
@@ -6486,30 +7356,7 @@
         </w:tcBorders>
       </w:tcPr>
     </w:tblStylePr>
-    <w:tblStylePr w:type="lastCol">
-      <w:rPr>
-        <w:i/>
-        <w:color w:val="404040"/>
-      </w:rPr>
-      <w:pPr>
-        <w:pBdr/>
-        <w:spacing/>
-        <w:ind/>
-      </w:pPr>
-      <w:tblPr>
-        <w:tblBorders/>
-      </w:tblPr>
-      <w:tcPr>
-        <w:shd w:color="ffffff"/>
-        <w:tcBorders>
-          <w:top w:val="none" w:color="000000" w:sz="4" w:space="0"/>
-          <w:left w:val="none" w:color="000000" w:sz="4" w:space="0"/>
-          <w:bottom w:val="none" w:color="000000" w:sz="4" w:space="0"/>
-          <w:right w:val="none" w:color="000000" w:sz="4" w:space="0"/>
-        </w:tcBorders>
-      </w:tcPr>
-    </w:tblStylePr>
-    <w:tblStylePr w:type="lastRow">
+    <w:tblStylePr w:type="firstRow">
       <w:rPr>
         <w:b/>
         <w:color w:val="404040"/>
@@ -6532,6 +7379,52 @@
         </w:tcBorders>
       </w:tcPr>
     </w:tblStylePr>
+    <w:tblStylePr w:type="lastCol">
+      <w:rPr>
+        <w:i/>
+        <w:color w:val="404040"/>
+      </w:rPr>
+      <w:pPr>
+        <w:pBdr/>
+        <w:spacing/>
+        <w:ind/>
+      </w:pPr>
+      <w:tblPr>
+        <w:tblBorders/>
+      </w:tblPr>
+      <w:tcPr>
+        <w:shd w:val="clear" w:color="ffffff"/>
+        <w:tcBorders>
+          <w:top w:val="none" w:color="000000" w:sz="4" w:space="0"/>
+          <w:left w:val="none" w:color="000000" w:sz="4" w:space="0"/>
+          <w:bottom w:val="none" w:color="000000" w:sz="4" w:space="0"/>
+          <w:right w:val="none" w:color="000000" w:sz="4" w:space="0"/>
+        </w:tcBorders>
+      </w:tcPr>
+    </w:tblStylePr>
+    <w:tblStylePr w:type="lastRow">
+      <w:rPr>
+        <w:b/>
+        <w:color w:val="404040"/>
+      </w:rPr>
+      <w:pPr>
+        <w:pBdr/>
+        <w:spacing/>
+        <w:ind/>
+      </w:pPr>
+      <w:tblPr>
+        <w:tblBorders/>
+      </w:tblPr>
+      <w:tcPr>
+        <w:shd w:val="clear" w:color="ffffff"/>
+        <w:tcBorders>
+          <w:top w:val="none" w:color="000000" w:sz="4" w:space="0"/>
+          <w:left w:val="none" w:color="000000" w:sz="4" w:space="0"/>
+          <w:bottom w:val="none" w:color="000000" w:sz="4" w:space="0"/>
+          <w:right w:val="none" w:color="000000" w:sz="4" w:space="0"/>
+        </w:tcBorders>
+      </w:tcPr>
+    </w:tblStylePr>
     <w:tblStylePr w:type="nwCell">
       <w:pPr>
         <w:pBdr/>
@@ -6598,9 +7491,9 @@
       </w:tcPr>
     </w:tblStylePr>
   </w:style>
-  <w:style w:type="table" w:styleId="39">
+  <w:style w:type="table" w:styleId="734">
     <w:name w:val="Grid Table 3 - Accent 6"/>
-    <w:basedOn w:val="665"/>
+    <w:basedOn w:val="893"/>
     <w:uiPriority w:val="99"/>
     <w:pPr>
       <w:pBdr/>
@@ -6699,29 +7592,6 @@
         <w:tblBorders/>
       </w:tblPr>
       <w:tcPr>
-        <w:shd w:color="ffffff"/>
-        <w:tcBorders>
-          <w:top w:val="none" w:color="000000" w:sz="4" w:space="0"/>
-          <w:left w:val="none" w:color="000000" w:sz="4" w:space="0"/>
-          <w:bottom w:val="none" w:color="000000" w:sz="4" w:space="0"/>
-          <w:right w:val="none" w:color="000000" w:sz="4" w:space="0"/>
-        </w:tcBorders>
-      </w:tcPr>
-    </w:tblStylePr>
-    <w:tblStylePr w:type="firstRow">
-      <w:rPr>
-        <w:b/>
-        <w:color w:val="404040"/>
-      </w:rPr>
-      <w:pPr>
-        <w:pBdr/>
-        <w:spacing/>
-        <w:ind/>
-      </w:pPr>
-      <w:tblPr>
-        <w:tblBorders/>
-      </w:tblPr>
-      <w:tcPr>
         <w:shd w:val="clear" w:color="ffffff"/>
         <w:tcBorders>
           <w:top w:val="none" w:color="000000" w:sz="4" w:space="0"/>
@@ -6731,30 +7601,7 @@
         </w:tcBorders>
       </w:tcPr>
     </w:tblStylePr>
-    <w:tblStylePr w:type="lastCol">
-      <w:rPr>
-        <w:i/>
-        <w:color w:val="404040"/>
-      </w:rPr>
-      <w:pPr>
-        <w:pBdr/>
-        <w:spacing/>
-        <w:ind/>
-      </w:pPr>
-      <w:tblPr>
-        <w:tblBorders/>
-      </w:tblPr>
-      <w:tcPr>
-        <w:shd w:color="ffffff"/>
-        <w:tcBorders>
-          <w:top w:val="none" w:color="000000" w:sz="4" w:space="0"/>
-          <w:left w:val="none" w:color="000000" w:sz="4" w:space="0"/>
-          <w:bottom w:val="none" w:color="000000" w:sz="4" w:space="0"/>
-          <w:right w:val="none" w:color="000000" w:sz="4" w:space="0"/>
-        </w:tcBorders>
-      </w:tcPr>
-    </w:tblStylePr>
-    <w:tblStylePr w:type="lastRow">
+    <w:tblStylePr w:type="firstRow">
       <w:rPr>
         <w:b/>
         <w:color w:val="404040"/>
@@ -6777,6 +7624,52 @@
         </w:tcBorders>
       </w:tcPr>
     </w:tblStylePr>
+    <w:tblStylePr w:type="lastCol">
+      <w:rPr>
+        <w:i/>
+        <w:color w:val="404040"/>
+      </w:rPr>
+      <w:pPr>
+        <w:pBdr/>
+        <w:spacing/>
+        <w:ind/>
+      </w:pPr>
+      <w:tblPr>
+        <w:tblBorders/>
+      </w:tblPr>
+      <w:tcPr>
+        <w:shd w:val="clear" w:color="ffffff"/>
+        <w:tcBorders>
+          <w:top w:val="none" w:color="000000" w:sz="4" w:space="0"/>
+          <w:left w:val="none" w:color="000000" w:sz="4" w:space="0"/>
+          <w:bottom w:val="none" w:color="000000" w:sz="4" w:space="0"/>
+          <w:right w:val="none" w:color="000000" w:sz="4" w:space="0"/>
+        </w:tcBorders>
+      </w:tcPr>
+    </w:tblStylePr>
+    <w:tblStylePr w:type="lastRow">
+      <w:rPr>
+        <w:b/>
+        <w:color w:val="404040"/>
+      </w:rPr>
+      <w:pPr>
+        <w:pBdr/>
+        <w:spacing/>
+        <w:ind/>
+      </w:pPr>
+      <w:tblPr>
+        <w:tblBorders/>
+      </w:tblPr>
+      <w:tcPr>
+        <w:shd w:val="clear" w:color="ffffff"/>
+        <w:tcBorders>
+          <w:top w:val="none" w:color="000000" w:sz="4" w:space="0"/>
+          <w:left w:val="none" w:color="000000" w:sz="4" w:space="0"/>
+          <w:bottom w:val="none" w:color="000000" w:sz="4" w:space="0"/>
+          <w:right w:val="none" w:color="000000" w:sz="4" w:space="0"/>
+        </w:tcBorders>
+      </w:tcPr>
+    </w:tblStylePr>
     <w:tblStylePr w:type="nwCell">
       <w:pPr>
         <w:pBdr/>
@@ -6843,9 +7736,9 @@
       </w:tcPr>
     </w:tblStylePr>
   </w:style>
-  <w:style w:type="table" w:styleId="40">
+  <w:style w:type="table" w:styleId="735">
     <w:name w:val="Grid Table 4"/>
-    <w:basedOn w:val="665"/>
+    <w:basedOn w:val="893"/>
     <w:uiPriority w:val="59"/>
     <w:pPr>
       <w:pBdr/>
@@ -7076,9 +7969,9 @@
       </w:tcPr>
     </w:tblStylePr>
   </w:style>
-  <w:style w:type="table" w:styleId="41">
+  <w:style w:type="table" w:styleId="736">
     <w:name w:val="Grid Table 4 - Accent 1"/>
-    <w:basedOn w:val="665"/>
+    <w:basedOn w:val="893"/>
     <w:uiPriority w:val="59"/>
     <w:pPr>
       <w:pBdr/>
@@ -7309,9 +8202,9 @@
       </w:tcPr>
     </w:tblStylePr>
   </w:style>
-  <w:style w:type="table" w:styleId="42">
+  <w:style w:type="table" w:styleId="737">
     <w:name w:val="Grid Table 4 - Accent 2"/>
-    <w:basedOn w:val="665"/>
+    <w:basedOn w:val="893"/>
     <w:uiPriority w:val="59"/>
     <w:pPr>
       <w:pBdr/>
@@ -7542,9 +8435,9 @@
       </w:tcPr>
     </w:tblStylePr>
   </w:style>
-  <w:style w:type="table" w:styleId="43">
+  <w:style w:type="table" w:styleId="738">
     <w:name w:val="Grid Table 4 - Accent 3"/>
-    <w:basedOn w:val="665"/>
+    <w:basedOn w:val="893"/>
     <w:uiPriority w:val="59"/>
     <w:pPr>
       <w:pBdr/>
@@ -7775,9 +8668,9 @@
       </w:tcPr>
     </w:tblStylePr>
   </w:style>
-  <w:style w:type="table" w:styleId="44">
+  <w:style w:type="table" w:styleId="739">
     <w:name w:val="Grid Table 4 - Accent 4"/>
-    <w:basedOn w:val="665"/>
+    <w:basedOn w:val="893"/>
     <w:uiPriority w:val="59"/>
     <w:pPr>
       <w:pBdr/>
@@ -8008,9 +8901,9 @@
       </w:tcPr>
     </w:tblStylePr>
   </w:style>
-  <w:style w:type="table" w:styleId="45">
+  <w:style w:type="table" w:styleId="740">
     <w:name w:val="Grid Table 4 - Accent 5"/>
-    <w:basedOn w:val="665"/>
+    <w:basedOn w:val="893"/>
     <w:uiPriority w:val="59"/>
     <w:pPr>
       <w:pBdr/>
@@ -8241,9 +9134,9 @@
       </w:tcPr>
     </w:tblStylePr>
   </w:style>
-  <w:style w:type="table" w:styleId="46">
+  <w:style w:type="table" w:styleId="741">
     <w:name w:val="Grid Table 4 - Accent 6"/>
-    <w:basedOn w:val="665"/>
+    <w:basedOn w:val="893"/>
     <w:uiPriority w:val="59"/>
     <w:pPr>
       <w:pBdr/>
@@ -8474,9 +9367,9 @@
       </w:tcPr>
     </w:tblStylePr>
   </w:style>
-  <w:style w:type="table" w:styleId="47">
+  <w:style w:type="table" w:styleId="742">
     <w:name w:val="Grid Table 5 Dark"/>
-    <w:basedOn w:val="665"/>
+    <w:basedOn w:val="893"/>
     <w:uiPriority w:val="99"/>
     <w:pPr>
       <w:pBdr/>
@@ -8702,9 +9595,9 @@
       </w:tcPr>
     </w:tblStylePr>
   </w:style>
-  <w:style w:type="table" w:styleId="48">
+  <w:style w:type="table" w:styleId="743">
     <w:name w:val="Grid Table 5 Dark- Accent 1"/>
-    <w:basedOn w:val="665"/>
+    <w:basedOn w:val="893"/>
     <w:uiPriority w:val="99"/>
     <w:pPr>
       <w:pBdr/>
@@ -8930,9 +9823,9 @@
       </w:tcPr>
     </w:tblStylePr>
   </w:style>
-  <w:style w:type="table" w:styleId="49">
+  <w:style w:type="table" w:styleId="744">
     <w:name w:val="Grid Table 5 Dark - Accent 2"/>
-    <w:basedOn w:val="665"/>
+    <w:basedOn w:val="893"/>
     <w:uiPriority w:val="99"/>
     <w:pPr>
       <w:pBdr/>
@@ -9158,9 +10051,9 @@
       </w:tcPr>
     </w:tblStylePr>
   </w:style>
-  <w:style w:type="table" w:styleId="50">
+  <w:style w:type="table" w:styleId="745">
     <w:name w:val="Grid Table 5 Dark - Accent 3"/>
-    <w:basedOn w:val="665"/>
+    <w:basedOn w:val="893"/>
     <w:uiPriority w:val="99"/>
     <w:pPr>
       <w:pBdr/>
@@ -9386,9 +10279,9 @@
       </w:tcPr>
     </w:tblStylePr>
   </w:style>
-  <w:style w:type="table" w:styleId="51">
+  <w:style w:type="table" w:styleId="746">
     <w:name w:val="Grid Table 5 Dark- Accent 4"/>
-    <w:basedOn w:val="665"/>
+    <w:basedOn w:val="893"/>
     <w:uiPriority w:val="99"/>
     <w:pPr>
       <w:pBdr/>
@@ -9614,9 +10507,9 @@
       </w:tcPr>
     </w:tblStylePr>
   </w:style>
-  <w:style w:type="table" w:styleId="52">
+  <w:style w:type="table" w:styleId="747">
     <w:name w:val="Grid Table 5 Dark - Accent 5"/>
-    <w:basedOn w:val="665"/>
+    <w:basedOn w:val="893"/>
     <w:uiPriority w:val="99"/>
     <w:pPr>
       <w:pBdr/>
@@ -9842,9 +10735,9 @@
       </w:tcPr>
     </w:tblStylePr>
   </w:style>
-  <w:style w:type="table" w:styleId="53">
+  <w:style w:type="table" w:styleId="748">
     <w:name w:val="Grid Table 5 Dark - Accent 6"/>
-    <w:basedOn w:val="665"/>
+    <w:basedOn w:val="893"/>
     <w:uiPriority w:val="99"/>
     <w:pPr>
       <w:pBdr/>
@@ -10070,9 +10963,9 @@
       </w:tcPr>
     </w:tblStylePr>
   </w:style>
-  <w:style w:type="table" w:styleId="54">
+  <w:style w:type="table" w:styleId="749">
     <w:name w:val="Grid Table 6 Colorful"/>
-    <w:basedOn w:val="665"/>
+    <w:basedOn w:val="893"/>
     <w:uiPriority w:val="99"/>
     <w:pPr>
       <w:pBdr/>
@@ -10300,9 +11193,9 @@
       </w:tcPr>
     </w:tblStylePr>
   </w:style>
-  <w:style w:type="table" w:styleId="55">
+  <w:style w:type="table" w:styleId="750">
     <w:name w:val="Grid Table 6 Colorful - Accent 1"/>
-    <w:basedOn w:val="665"/>
+    <w:basedOn w:val="893"/>
     <w:uiPriority w:val="99"/>
     <w:pPr>
       <w:pBdr/>
@@ -10530,9 +11423,9 @@
       </w:tcPr>
     </w:tblStylePr>
   </w:style>
-  <w:style w:type="table" w:styleId="56">
+  <w:style w:type="table" w:styleId="751">
     <w:name w:val="Grid Table 6 Colorful - Accent 2"/>
-    <w:basedOn w:val="665"/>
+    <w:basedOn w:val="893"/>
     <w:uiPriority w:val="99"/>
     <w:pPr>
       <w:pBdr/>
@@ -10760,9 +11653,9 @@
       </w:tcPr>
     </w:tblStylePr>
   </w:style>
-  <w:style w:type="table" w:styleId="57">
+  <w:style w:type="table" w:styleId="752">
     <w:name w:val="Grid Table 6 Colorful - Accent 3"/>
-    <w:basedOn w:val="665"/>
+    <w:basedOn w:val="893"/>
     <w:uiPriority w:val="99"/>
     <w:pPr>
       <w:pBdr/>
@@ -10990,9 +11883,9 @@
       </w:tcPr>
     </w:tblStylePr>
   </w:style>
-  <w:style w:type="table" w:styleId="58">
+  <w:style w:type="table" w:styleId="753">
     <w:name w:val="Grid Table 6 Colorful - Accent 4"/>
-    <w:basedOn w:val="665"/>
+    <w:basedOn w:val="893"/>
     <w:uiPriority w:val="99"/>
     <w:pPr>
       <w:pBdr/>
@@ -11220,9 +12113,9 @@
       </w:tcPr>
     </w:tblStylePr>
   </w:style>
-  <w:style w:type="table" w:styleId="59">
+  <w:style w:type="table" w:styleId="754">
     <w:name w:val="Grid Table 6 Colorful - Accent 5"/>
-    <w:basedOn w:val="665"/>
+    <w:basedOn w:val="893"/>
     <w:uiPriority w:val="99"/>
     <w:pPr>
       <w:pBdr/>
@@ -11450,9 +12343,9 @@
       </w:tcPr>
     </w:tblStylePr>
   </w:style>
-  <w:style w:type="table" w:styleId="60">
+  <w:style w:type="table" w:styleId="755">
     <w:name w:val="Grid Table 6 Colorful - Accent 6"/>
-    <w:basedOn w:val="665"/>
+    <w:basedOn w:val="893"/>
     <w:uiPriority w:val="99"/>
     <w:pPr>
       <w:pBdr/>
@@ -11680,9 +12573,9 @@
       </w:tcPr>
     </w:tblStylePr>
   </w:style>
-  <w:style w:type="table" w:styleId="61">
+  <w:style w:type="table" w:styleId="756">
     <w:name w:val="Grid Table 7 Colorful"/>
-    <w:basedOn w:val="665"/>
+    <w:basedOn w:val="893"/>
     <w:uiPriority w:val="99"/>
     <w:pPr>
       <w:pBdr/>
@@ -11784,11 +12677,11 @@
         <w:tblBorders/>
       </w:tblPr>
       <w:tcPr>
-        <w:shd w:color="ffffff"/>
+        <w:shd w:val="clear" w:color="ffffff"/>
         <w:tcBorders>
-          <w:top w:val="none"/>
-          <w:left w:val="none"/>
-          <w:bottom w:val="none"/>
+          <w:top w:val="none" w:color="000000" w:sz="4" w:space="0"/>
+          <w:left w:val="none" w:color="000000" w:sz="4" w:space="0"/>
+          <w:bottom w:val="none" w:color="000000" w:sz="4" w:space="0"/>
           <w:right w:val="single" w:color="000000" w:themeColor="text1" w:themeTint="80" w:sz="4" w:space="0"/>
         </w:tcBorders>
       </w:tcPr>
@@ -11811,10 +12704,10 @@
       <w:tcPr>
         <w:shd w:val="clear" w:color="ffffff" w:themeColor="light1" w:fill="ffffff" w:themeFill="light1"/>
         <w:tcBorders>
-          <w:top w:val="none"/>
-          <w:left w:val="none"/>
+          <w:top w:val="none" w:color="000000" w:sz="4" w:space="0"/>
+          <w:left w:val="none" w:color="000000" w:sz="4" w:space="0"/>
           <w:bottom w:val="single" w:color="000000" w:themeColor="text1" w:themeTint="80" w:sz="4" w:space="0"/>
-          <w:right w:val="none"/>
+          <w:right w:val="none" w:color="000000" w:sz="4" w:space="0"/>
         </w:tcBorders>
       </w:tcPr>
     </w:tblStylePr>
@@ -11834,12 +12727,12 @@
         <w:tblBorders/>
       </w:tblPr>
       <w:tcPr>
-        <w:shd w:color="ffffff"/>
+        <w:shd w:val="clear" w:color="ffffff"/>
         <w:tcBorders>
-          <w:top w:val="none"/>
+          <w:top w:val="none" w:color="000000" w:sz="4" w:space="0"/>
           <w:left w:val="single" w:color="000000" w:themeColor="text1" w:themeTint="80" w:sz="4" w:space="0"/>
-          <w:bottom w:val="none"/>
-          <w:right w:val="none"/>
+          <w:bottom w:val="none" w:color="000000" w:sz="4" w:space="0"/>
+          <w:right w:val="none" w:color="000000" w:sz="4" w:space="0"/>
         </w:tcBorders>
       </w:tcPr>
     </w:tblStylePr>
@@ -11862,9 +12755,9 @@
         <w:shd w:val="clear" w:color="ffffff" w:themeColor="light1" w:fill="ffffff" w:themeFill="light1"/>
         <w:tcBorders>
           <w:top w:val="single" w:color="000000" w:themeColor="text1" w:themeTint="80" w:sz="4" w:space="0"/>
-          <w:left w:val="none"/>
-          <w:bottom w:val="none"/>
-          <w:right w:val="none"/>
+          <w:left w:val="none" w:color="000000" w:sz="4" w:space="0"/>
+          <w:bottom w:val="none" w:color="000000" w:sz="4" w:space="0"/>
+          <w:right w:val="none" w:color="000000" w:sz="4" w:space="0"/>
         </w:tcBorders>
       </w:tcPr>
     </w:tblStylePr>
@@ -11934,9 +12827,9 @@
       </w:tcPr>
     </w:tblStylePr>
   </w:style>
-  <w:style w:type="table" w:styleId="62">
+  <w:style w:type="table" w:styleId="757">
     <w:name w:val="Grid Table 7 Colorful - Accent 1"/>
-    <w:basedOn w:val="665"/>
+    <w:basedOn w:val="893"/>
     <w:uiPriority w:val="99"/>
     <w:pPr>
       <w:pBdr/>
@@ -12038,11 +12931,11 @@
         <w:tblBorders/>
       </w:tblPr>
       <w:tcPr>
-        <w:shd w:color="ffffff"/>
+        <w:shd w:val="clear" w:color="ffffff"/>
         <w:tcBorders>
-          <w:top w:val="none"/>
-          <w:left w:val="none"/>
-          <w:bottom w:val="none"/>
+          <w:top w:val="none" w:color="000000" w:sz="4" w:space="0"/>
+          <w:left w:val="none" w:color="000000" w:sz="4" w:space="0"/>
+          <w:bottom w:val="none" w:color="000000" w:sz="4" w:space="0"/>
           <w:right w:val="single" w:color="000000" w:themeColor="accent1" w:themeTint="80" w:sz="4" w:space="0"/>
         </w:tcBorders>
       </w:tcPr>
@@ -12065,10 +12958,10 @@
       <w:tcPr>
         <w:shd w:val="clear" w:color="ffffff" w:themeColor="light1" w:fill="ffffff" w:themeFill="light1"/>
         <w:tcBorders>
-          <w:top w:val="none"/>
-          <w:left w:val="none"/>
+          <w:top w:val="none" w:color="000000" w:sz="4" w:space="0"/>
+          <w:left w:val="none" w:color="000000" w:sz="4" w:space="0"/>
           <w:bottom w:val="single" w:color="000000" w:themeColor="accent1" w:themeTint="80" w:sz="4" w:space="0"/>
-          <w:right w:val="none"/>
+          <w:right w:val="none" w:color="000000" w:sz="4" w:space="0"/>
         </w:tcBorders>
       </w:tcPr>
     </w:tblStylePr>
@@ -12088,12 +12981,12 @@
         <w:tblBorders/>
       </w:tblPr>
       <w:tcPr>
-        <w:shd w:color="ffffff"/>
+        <w:shd w:val="clear" w:color="ffffff"/>
         <w:tcBorders>
-          <w:top w:val="none"/>
+          <w:top w:val="none" w:color="000000" w:sz="4" w:space="0"/>
           <w:left w:val="single" w:color="000000" w:themeColor="accent1" w:themeTint="80" w:sz="4" w:space="0"/>
-          <w:bottom w:val="none"/>
-          <w:right w:val="none"/>
+          <w:bottom w:val="none" w:color="000000" w:sz="4" w:space="0"/>
+          <w:right w:val="none" w:color="000000" w:sz="4" w:space="0"/>
         </w:tcBorders>
       </w:tcPr>
     </w:tblStylePr>
@@ -12116,9 +13009,9 @@
         <w:shd w:val="clear" w:color="ffffff" w:themeColor="light1" w:fill="ffffff" w:themeFill="light1"/>
         <w:tcBorders>
           <w:top w:val="single" w:color="000000" w:themeColor="accent1" w:themeTint="80" w:sz="4" w:space="0"/>
-          <w:left w:val="none"/>
-          <w:bottom w:val="none"/>
-          <w:right w:val="none"/>
+          <w:left w:val="none" w:color="000000" w:sz="4" w:space="0"/>
+          <w:bottom w:val="none" w:color="000000" w:sz="4" w:space="0"/>
+          <w:right w:val="none" w:color="000000" w:sz="4" w:space="0"/>
         </w:tcBorders>
       </w:tcPr>
     </w:tblStylePr>
@@ -12188,9 +13081,9 @@
       </w:tcPr>
     </w:tblStylePr>
   </w:style>
-  <w:style w:type="table" w:styleId="63">
+  <w:style w:type="table" w:styleId="758">
     <w:name w:val="Grid Table 7 Colorful - Accent 2"/>
-    <w:basedOn w:val="665"/>
+    <w:basedOn w:val="893"/>
     <w:uiPriority w:val="99"/>
     <w:pPr>
       <w:pBdr/>
@@ -12292,11 +13185,11 @@
         <w:tblBorders/>
       </w:tblPr>
       <w:tcPr>
-        <w:shd w:color="ffffff"/>
+        <w:shd w:val="clear" w:color="ffffff"/>
         <w:tcBorders>
-          <w:top w:val="none"/>
-          <w:left w:val="none"/>
-          <w:bottom w:val="none"/>
+          <w:top w:val="none" w:color="000000" w:sz="4" w:space="0"/>
+          <w:left w:val="none" w:color="000000" w:sz="4" w:space="0"/>
+          <w:bottom w:val="none" w:color="000000" w:sz="4" w:space="0"/>
           <w:right w:val="single" w:color="000000" w:themeColor="accent2" w:themeTint="97" w:sz="4" w:space="0"/>
         </w:tcBorders>
       </w:tcPr>
@@ -12319,10 +13212,10 @@
       <w:tcPr>
         <w:shd w:val="clear" w:color="ffffff" w:themeColor="light1" w:fill="ffffff" w:themeFill="light1"/>
         <w:tcBorders>
-          <w:top w:val="none"/>
-          <w:left w:val="none"/>
+          <w:top w:val="none" w:color="000000" w:sz="4" w:space="0"/>
+          <w:left w:val="none" w:color="000000" w:sz="4" w:space="0"/>
           <w:bottom w:val="single" w:color="000000" w:themeColor="accent2" w:themeTint="97" w:sz="4" w:space="0"/>
-          <w:right w:val="none"/>
+          <w:right w:val="none" w:color="000000" w:sz="4" w:space="0"/>
         </w:tcBorders>
       </w:tcPr>
     </w:tblStylePr>
@@ -12342,12 +13235,12 @@
         <w:tblBorders/>
       </w:tblPr>
       <w:tcPr>
-        <w:shd w:color="ffffff"/>
+        <w:shd w:val="clear" w:color="ffffff"/>
         <w:tcBorders>
-          <w:top w:val="none"/>
+          <w:top w:val="none" w:color="000000" w:sz="4" w:space="0"/>
           <w:left w:val="single" w:color="000000" w:themeColor="accent2" w:themeTint="97" w:sz="4" w:space="0"/>
-          <w:bottom w:val="none"/>
-          <w:right w:val="none"/>
+          <w:bottom w:val="none" w:color="000000" w:sz="4" w:space="0"/>
+          <w:right w:val="none" w:color="000000" w:sz="4" w:space="0"/>
         </w:tcBorders>
       </w:tcPr>
     </w:tblStylePr>
@@ -12370,9 +13263,9 @@
         <w:shd w:val="clear" w:color="ffffff" w:themeColor="light1" w:fill="ffffff" w:themeFill="light1"/>
         <w:tcBorders>
           <w:top w:val="single" w:color="000000" w:themeColor="accent2" w:themeTint="97" w:sz="4" w:space="0"/>
-          <w:left w:val="none"/>
-          <w:bottom w:val="none"/>
-          <w:right w:val="none"/>
+          <w:left w:val="none" w:color="000000" w:sz="4" w:space="0"/>
+          <w:bottom w:val="none" w:color="000000" w:sz="4" w:space="0"/>
+          <w:right w:val="none" w:color="000000" w:sz="4" w:space="0"/>
         </w:tcBorders>
       </w:tcPr>
     </w:tblStylePr>
@@ -12442,9 +13335,9 @@
       </w:tcPr>
     </w:tblStylePr>
   </w:style>
-  <w:style w:type="table" w:styleId="64">
+  <w:style w:type="table" w:styleId="759">
     <w:name w:val="Grid Table 7 Colorful - Accent 3"/>
-    <w:basedOn w:val="665"/>
+    <w:basedOn w:val="893"/>
     <w:uiPriority w:val="99"/>
     <w:pPr>
       <w:pBdr/>
@@ -12546,11 +13439,11 @@
         <w:tblBorders/>
       </w:tblPr>
       <w:tcPr>
-        <w:shd w:color="ffffff"/>
+        <w:shd w:val="clear" w:color="ffffff"/>
         <w:tcBorders>
-          <w:top w:val="none"/>
-          <w:left w:val="none"/>
-          <w:bottom w:val="none"/>
+          <w:top w:val="none" w:color="000000" w:sz="4" w:space="0"/>
+          <w:left w:val="none" w:color="000000" w:sz="4" w:space="0"/>
+          <w:bottom w:val="none" w:color="000000" w:sz="4" w:space="0"/>
           <w:right w:val="single" w:color="000000" w:themeColor="accent3" w:themeTint="FE" w:sz="4" w:space="0"/>
         </w:tcBorders>
       </w:tcPr>
@@ -12573,10 +13466,10 @@
       <w:tcPr>
         <w:shd w:val="clear" w:color="ffffff" w:themeColor="light1" w:fill="ffffff" w:themeFill="light1"/>
         <w:tcBorders>
-          <w:top w:val="none"/>
-          <w:left w:val="none"/>
+          <w:top w:val="none" w:color="000000" w:sz="4" w:space="0"/>
+          <w:left w:val="none" w:color="000000" w:sz="4" w:space="0"/>
           <w:bottom w:val="single" w:color="000000" w:themeColor="accent3" w:themeTint="FE" w:sz="4" w:space="0"/>
-          <w:right w:val="none"/>
+          <w:right w:val="none" w:color="000000" w:sz="4" w:space="0"/>
         </w:tcBorders>
       </w:tcPr>
     </w:tblStylePr>
@@ -12596,12 +13489,12 @@
         <w:tblBorders/>
       </w:tblPr>
       <w:tcPr>
-        <w:shd w:color="ffffff"/>
+        <w:shd w:val="clear" w:color="ffffff"/>
         <w:tcBorders>
-          <w:top w:val="none"/>
+          <w:top w:val="none" w:color="000000" w:sz="4" w:space="0"/>
           <w:left w:val="single" w:color="000000" w:themeColor="accent3" w:themeTint="FE" w:sz="4" w:space="0"/>
-          <w:bottom w:val="none"/>
-          <w:right w:val="none"/>
+          <w:bottom w:val="none" w:color="000000" w:sz="4" w:space="0"/>
+          <w:right w:val="none" w:color="000000" w:sz="4" w:space="0"/>
         </w:tcBorders>
       </w:tcPr>
     </w:tblStylePr>
@@ -12624,9 +13517,9 @@
         <w:shd w:val="clear" w:color="ffffff" w:themeColor="light1" w:fill="ffffff" w:themeFill="light1"/>
         <w:tcBorders>
           <w:top w:val="single" w:color="000000" w:themeColor="accent3" w:themeTint="FE" w:sz="4" w:space="0"/>
-          <w:left w:val="none"/>
-          <w:bottom w:val="none"/>
-          <w:right w:val="none"/>
+          <w:left w:val="none" w:color="000000" w:sz="4" w:space="0"/>
+          <w:bottom w:val="none" w:color="000000" w:sz="4" w:space="0"/>
+          <w:right w:val="none" w:color="000000" w:sz="4" w:space="0"/>
         </w:tcBorders>
       </w:tcPr>
     </w:tblStylePr>
@@ -12696,9 +13589,9 @@
       </w:tcPr>
     </w:tblStylePr>
   </w:style>
-  <w:style w:type="table" w:styleId="65">
+  <w:style w:type="table" w:styleId="760">
     <w:name w:val="Grid Table 7 Colorful - Accent 4"/>
-    <w:basedOn w:val="665"/>
+    <w:basedOn w:val="893"/>
     <w:uiPriority w:val="99"/>
     <w:pPr>
       <w:pBdr/>
@@ -12800,11 +13693,11 @@
         <w:tblBorders/>
       </w:tblPr>
       <w:tcPr>
-        <w:shd w:color="ffffff"/>
+        <w:shd w:val="clear" w:color="ffffff"/>
         <w:tcBorders>
-          <w:top w:val="none"/>
-          <w:left w:val="none"/>
-          <w:bottom w:val="none"/>
+          <w:top w:val="none" w:color="000000" w:sz="4" w:space="0"/>
+          <w:left w:val="none" w:color="000000" w:sz="4" w:space="0"/>
+          <w:bottom w:val="none" w:color="000000" w:sz="4" w:space="0"/>
           <w:right w:val="single" w:color="000000" w:themeColor="accent4" w:themeTint="9A" w:sz="4" w:space="0"/>
         </w:tcBorders>
       </w:tcPr>
@@ -12827,10 +13720,10 @@
       <w:tcPr>
         <w:shd w:val="clear" w:color="ffffff" w:themeColor="light1" w:fill="ffffff" w:themeFill="light1"/>
         <w:tcBorders>
-          <w:top w:val="none"/>
-          <w:left w:val="none"/>
+          <w:top w:val="none" w:color="000000" w:sz="4" w:space="0"/>
+          <w:left w:val="none" w:color="000000" w:sz="4" w:space="0"/>
           <w:bottom w:val="single" w:color="000000" w:themeColor="accent4" w:themeTint="9A" w:sz="4" w:space="0"/>
-          <w:right w:val="none"/>
+          <w:right w:val="none" w:color="000000" w:sz="4" w:space="0"/>
         </w:tcBorders>
       </w:tcPr>
     </w:tblStylePr>
@@ -12850,12 +13743,12 @@
         <w:tblBorders/>
       </w:tblPr>
       <w:tcPr>
-        <w:shd w:color="ffffff"/>
+        <w:shd w:val="clear" w:color="ffffff"/>
         <w:tcBorders>
-          <w:top w:val="none"/>
+          <w:top w:val="none" w:color="000000" w:sz="4" w:space="0"/>
           <w:left w:val="single" w:color="000000" w:themeColor="accent4" w:themeTint="9A" w:sz="4" w:space="0"/>
-          <w:bottom w:val="none"/>
-          <w:right w:val="none"/>
+          <w:bottom w:val="none" w:color="000000" w:sz="4" w:space="0"/>
+          <w:right w:val="none" w:color="000000" w:sz="4" w:space="0"/>
         </w:tcBorders>
       </w:tcPr>
     </w:tblStylePr>
@@ -12878,9 +13771,9 @@
         <w:shd w:val="clear" w:color="ffffff" w:themeColor="light1" w:fill="ffffff" w:themeFill="light1"/>
         <w:tcBorders>
           <w:top w:val="single" w:color="000000" w:themeColor="accent4" w:themeTint="9A" w:sz="4" w:space="0"/>
-          <w:left w:val="none"/>
-          <w:bottom w:val="none"/>
-          <w:right w:val="none"/>
+          <w:left w:val="none" w:color="000000" w:sz="4" w:space="0"/>
+          <w:bottom w:val="none" w:color="000000" w:sz="4" w:space="0"/>
+          <w:right w:val="none" w:color="000000" w:sz="4" w:space="0"/>
         </w:tcBorders>
       </w:tcPr>
     </w:tblStylePr>
@@ -12950,9 +13843,9 @@
       </w:tcPr>
     </w:tblStylePr>
   </w:style>
-  <w:style w:type="table" w:styleId="66">
+  <w:style w:type="table" w:styleId="761">
     <w:name w:val="Grid Table 7 Colorful - Accent 5"/>
-    <w:basedOn w:val="665"/>
+    <w:basedOn w:val="893"/>
     <w:uiPriority w:val="99"/>
     <w:pPr>
       <w:pBdr/>
@@ -13054,11 +13947,11 @@
         <w:tblBorders/>
       </w:tblPr>
       <w:tcPr>
-        <w:shd w:color="ffffff"/>
+        <w:shd w:val="clear" w:color="ffffff"/>
         <w:tcBorders>
-          <w:top w:val="none"/>
-          <w:left w:val="none"/>
-          <w:bottom w:val="none"/>
+          <w:top w:val="none" w:color="000000" w:sz="4" w:space="0"/>
+          <w:left w:val="none" w:color="000000" w:sz="4" w:space="0"/>
+          <w:bottom w:val="none" w:color="000000" w:sz="4" w:space="0"/>
           <w:right w:val="single" w:color="000000" w:themeColor="accent5" w:themeTint="90" w:sz="4" w:space="0"/>
         </w:tcBorders>
       </w:tcPr>
@@ -13081,10 +13974,10 @@
       <w:tcPr>
         <w:shd w:val="clear" w:color="ffffff" w:themeColor="light1" w:fill="ffffff" w:themeFill="light1"/>
         <w:tcBorders>
-          <w:top w:val="none"/>
-          <w:left w:val="none"/>
+          <w:top w:val="none" w:color="000000" w:sz="4" w:space="0"/>
+          <w:left w:val="none" w:color="000000" w:sz="4" w:space="0"/>
           <w:bottom w:val="single" w:color="000000" w:themeColor="accent5" w:themeTint="90" w:sz="4" w:space="0"/>
-          <w:right w:val="none"/>
+          <w:right w:val="none" w:color="000000" w:sz="4" w:space="0"/>
         </w:tcBorders>
       </w:tcPr>
     </w:tblStylePr>
@@ -13104,12 +13997,12 @@
         <w:tblBorders/>
       </w:tblPr>
       <w:tcPr>
-        <w:shd w:color="ffffff"/>
+        <w:shd w:val="clear" w:color="ffffff"/>
         <w:tcBorders>
-          <w:top w:val="none"/>
+          <w:top w:val="none" w:color="000000" w:sz="4" w:space="0"/>
           <w:left w:val="single" w:color="000000" w:themeColor="accent5" w:themeTint="90" w:sz="4" w:space="0"/>
-          <w:bottom w:val="none"/>
-          <w:right w:val="none"/>
+          <w:bottom w:val="none" w:color="000000" w:sz="4" w:space="0"/>
+          <w:right w:val="none" w:color="000000" w:sz="4" w:space="0"/>
         </w:tcBorders>
       </w:tcPr>
     </w:tblStylePr>
@@ -13132,9 +14025,9 @@
         <w:shd w:val="clear" w:color="ffffff" w:themeColor="light1" w:fill="ffffff" w:themeFill="light1"/>
         <w:tcBorders>
           <w:top w:val="single" w:color="000000" w:themeColor="accent5" w:themeTint="90" w:sz="4" w:space="0"/>
-          <w:left w:val="none"/>
-          <w:bottom w:val="none"/>
-          <w:right w:val="none"/>
+          <w:left w:val="none" w:color="000000" w:sz="4" w:space="0"/>
+          <w:bottom w:val="none" w:color="000000" w:sz="4" w:space="0"/>
+          <w:right w:val="none" w:color="000000" w:sz="4" w:space="0"/>
         </w:tcBorders>
       </w:tcPr>
     </w:tblStylePr>
@@ -13204,9 +14097,9 @@
       </w:tcPr>
     </w:tblStylePr>
   </w:style>
-  <w:style w:type="table" w:styleId="67">
+  <w:style w:type="table" w:styleId="762">
     <w:name w:val="Grid Table 7 Colorful - Accent 6"/>
-    <w:basedOn w:val="665"/>
+    <w:basedOn w:val="893"/>
     <w:uiPriority w:val="99"/>
     <w:pPr>
       <w:pBdr/>
@@ -13308,11 +14201,11 @@
         <w:tblBorders/>
       </w:tblPr>
       <w:tcPr>
-        <w:shd w:color="ffffff"/>
+        <w:shd w:val="clear" w:color="ffffff"/>
         <w:tcBorders>
-          <w:top w:val="none"/>
-          <w:left w:val="none"/>
-          <w:bottom w:val="none"/>
+          <w:top w:val="none" w:color="000000" w:sz="4" w:space="0"/>
+          <w:left w:val="none" w:color="000000" w:sz="4" w:space="0"/>
+          <w:bottom w:val="none" w:color="000000" w:sz="4" w:space="0"/>
           <w:right w:val="single" w:color="000000" w:themeColor="accent6" w:themeTint="90" w:sz="4" w:space="0"/>
         </w:tcBorders>
       </w:tcPr>
@@ -13335,10 +14228,10 @@
       <w:tcPr>
         <w:shd w:val="clear" w:color="ffffff" w:themeColor="light1" w:fill="ffffff" w:themeFill="light1"/>
         <w:tcBorders>
-          <w:top w:val="none"/>
-          <w:left w:val="none"/>
+          <w:top w:val="none" w:color="000000" w:sz="4" w:space="0"/>
+          <w:left w:val="none" w:color="000000" w:sz="4" w:space="0"/>
           <w:bottom w:val="single" w:color="000000" w:themeColor="accent6" w:themeTint="90" w:sz="4" w:space="0"/>
-          <w:right w:val="none"/>
+          <w:right w:val="none" w:color="000000" w:sz="4" w:space="0"/>
         </w:tcBorders>
       </w:tcPr>
     </w:tblStylePr>
@@ -13358,12 +14251,12 @@
         <w:tblBorders/>
       </w:tblPr>
       <w:tcPr>
-        <w:shd w:color="ffffff"/>
+        <w:shd w:val="clear" w:color="ffffff"/>
         <w:tcBorders>
-          <w:top w:val="none"/>
+          <w:top w:val="none" w:color="000000" w:sz="4" w:space="0"/>
           <w:left w:val="single" w:color="000000" w:themeColor="accent6" w:themeTint="90" w:sz="4" w:space="0"/>
-          <w:bottom w:val="none"/>
-          <w:right w:val="none"/>
+          <w:bottom w:val="none" w:color="000000" w:sz="4" w:space="0"/>
+          <w:right w:val="none" w:color="000000" w:sz="4" w:space="0"/>
         </w:tcBorders>
       </w:tcPr>
     </w:tblStylePr>
@@ -13386,9 +14279,9 @@
         <w:shd w:val="clear" w:color="ffffff" w:themeColor="light1" w:fill="ffffff" w:themeFill="light1"/>
         <w:tcBorders>
           <w:top w:val="single" w:color="000000" w:themeColor="accent6" w:themeTint="90" w:sz="4" w:space="0"/>
-          <w:left w:val="none"/>
-          <w:bottom w:val="none"/>
-          <w:right w:val="none"/>
+          <w:left w:val="none" w:color="000000" w:sz="4" w:space="0"/>
+          <w:bottom w:val="none" w:color="000000" w:sz="4" w:space="0"/>
+          <w:right w:val="none" w:color="000000" w:sz="4" w:space="0"/>
         </w:tcBorders>
       </w:tcPr>
     </w:tblStylePr>
@@ -13458,9 +14351,9 @@
       </w:tcPr>
     </w:tblStylePr>
   </w:style>
-  <w:style w:type="table" w:styleId="68">
+  <w:style w:type="table" w:styleId="763">
     <w:name w:val="List Table 1 Light"/>
-    <w:basedOn w:val="665"/>
+    <w:basedOn w:val="893"/>
     <w:uiPriority w:val="99"/>
     <w:pPr>
       <w:pBdr/>
@@ -13674,9 +14567,9 @@
       </w:tcPr>
     </w:tblStylePr>
   </w:style>
-  <w:style w:type="table" w:styleId="69">
+  <w:style w:type="table" w:styleId="764">
     <w:name w:val="List Table 1 Light - Accent 1"/>
-    <w:basedOn w:val="665"/>
+    <w:basedOn w:val="893"/>
     <w:uiPriority w:val="99"/>
     <w:pPr>
       <w:pBdr/>
@@ -13890,9 +14783,9 @@
       </w:tcPr>
     </w:tblStylePr>
   </w:style>
-  <w:style w:type="table" w:styleId="70">
+  <w:style w:type="table" w:styleId="765">
     <w:name w:val="List Table 1 Light - Accent 2"/>
-    <w:basedOn w:val="665"/>
+    <w:basedOn w:val="893"/>
     <w:uiPriority w:val="99"/>
     <w:pPr>
       <w:pBdr/>
@@ -14106,9 +14999,9 @@
       </w:tcPr>
     </w:tblStylePr>
   </w:style>
-  <w:style w:type="table" w:styleId="71">
+  <w:style w:type="table" w:styleId="766">
     <w:name w:val="List Table 1 Light - Accent 3"/>
-    <w:basedOn w:val="665"/>
+    <w:basedOn w:val="893"/>
     <w:uiPriority w:val="99"/>
     <w:pPr>
       <w:pBdr/>
@@ -14322,9 +15215,9 @@
       </w:tcPr>
     </w:tblStylePr>
   </w:style>
-  <w:style w:type="table" w:styleId="72">
+  <w:style w:type="table" w:styleId="767">
     <w:name w:val="List Table 1 Light - Accent 4"/>
-    <w:basedOn w:val="665"/>
+    <w:basedOn w:val="893"/>
     <w:uiPriority w:val="99"/>
     <w:pPr>
       <w:pBdr/>
@@ -14538,9 +15431,9 @@
       </w:tcPr>
     </w:tblStylePr>
   </w:style>
-  <w:style w:type="table" w:styleId="73">
+  <w:style w:type="table" w:styleId="768">
     <w:name w:val="List Table 1 Light - Accent 5"/>
-    <w:basedOn w:val="665"/>
+    <w:basedOn w:val="893"/>
     <w:uiPriority w:val="99"/>
     <w:pPr>
       <w:pBdr/>
@@ -14754,9 +15647,9 @@
       </w:tcPr>
     </w:tblStylePr>
   </w:style>
-  <w:style w:type="table" w:styleId="74">
+  <w:style w:type="table" w:styleId="769">
     <w:name w:val="List Table 1 Light - Accent 6"/>
-    <w:basedOn w:val="665"/>
+    <w:basedOn w:val="893"/>
     <w:uiPriority w:val="99"/>
     <w:pPr>
       <w:pBdr/>
@@ -14970,9 +15863,9 @@
       </w:tcPr>
     </w:tblStylePr>
   </w:style>
-  <w:style w:type="table" w:styleId="75">
+  <w:style w:type="table" w:styleId="770">
     <w:name w:val="List Table 2"/>
-    <w:basedOn w:val="665"/>
+    <w:basedOn w:val="893"/>
     <w:uiPriority w:val="99"/>
     <w:pPr>
       <w:pBdr/>
@@ -15208,9 +16101,9 @@
       </w:tcPr>
     </w:tblStylePr>
   </w:style>
-  <w:style w:type="table" w:styleId="76">
+  <w:style w:type="table" w:styleId="771">
     <w:name w:val="List Table 2 - Accent 1"/>
-    <w:basedOn w:val="665"/>
+    <w:basedOn w:val="893"/>
     <w:uiPriority w:val="99"/>
     <w:pPr>
       <w:pBdr/>
@@ -15446,9 +16339,9 @@
       </w:tcPr>
     </w:tblStylePr>
   </w:style>
-  <w:style w:type="table" w:styleId="77">
+  <w:style w:type="table" w:styleId="772">
     <w:name w:val="List Table 2 - Accent 2"/>
-    <w:basedOn w:val="665"/>
+    <w:basedOn w:val="893"/>
     <w:uiPriority w:val="99"/>
     <w:pPr>
       <w:pBdr/>
@@ -15684,9 +16577,9 @@
       </w:tcPr>
     </w:tblStylePr>
   </w:style>
-  <w:style w:type="table" w:styleId="78">
+  <w:style w:type="table" w:styleId="773">
     <w:name w:val="List Table 2 - Accent 3"/>
-    <w:basedOn w:val="665"/>
+    <w:basedOn w:val="893"/>
     <w:uiPriority w:val="99"/>
     <w:pPr>
       <w:pBdr/>
@@ -15922,9 +16815,9 @@
       </w:tcPr>
     </w:tblStylePr>
   </w:style>
-  <w:style w:type="table" w:styleId="79">
+  <w:style w:type="table" w:styleId="774">
     <w:name w:val="List Table 2 - Accent 4"/>
-    <w:basedOn w:val="665"/>
+    <w:basedOn w:val="893"/>
     <w:uiPriority w:val="99"/>
     <w:pPr>
       <w:pBdr/>
@@ -16160,9 +17053,9 @@
       </w:tcPr>
     </w:tblStylePr>
   </w:style>
-  <w:style w:type="table" w:styleId="80">
+  <w:style w:type="table" w:styleId="775">
     <w:name w:val="List Table 2 - Accent 5"/>
-    <w:basedOn w:val="665"/>
+    <w:basedOn w:val="893"/>
     <w:uiPriority w:val="99"/>
     <w:pPr>
       <w:pBdr/>
@@ -16398,9 +17291,9 @@
       </w:tcPr>
     </w:tblStylePr>
   </w:style>
-  <w:style w:type="table" w:styleId="81">
+  <w:style w:type="table" w:styleId="776">
     <w:name w:val="List Table 2 - Accent 6"/>
-    <w:basedOn w:val="665"/>
+    <w:basedOn w:val="893"/>
     <w:uiPriority w:val="99"/>
     <w:pPr>
       <w:pBdr/>
@@ -16636,9 +17529,9 @@
       </w:tcPr>
     </w:tblStylePr>
   </w:style>
-  <w:style w:type="table" w:styleId="82">
+  <w:style w:type="table" w:styleId="777">
     <w:name w:val="List Table 3"/>
-    <w:basedOn w:val="665"/>
+    <w:basedOn w:val="893"/>
     <w:uiPriority w:val="99"/>
     <w:pPr>
       <w:pBdr/>
@@ -16864,9 +17757,9 @@
       </w:tcPr>
     </w:tblStylePr>
   </w:style>
-  <w:style w:type="table" w:styleId="83">
+  <w:style w:type="table" w:styleId="778">
     <w:name w:val="List Table 3 - Accent 1"/>
-    <w:basedOn w:val="665"/>
+    <w:basedOn w:val="893"/>
     <w:uiPriority w:val="99"/>
     <w:pPr>
       <w:pBdr/>
@@ -17092,9 +17985,9 @@
       </w:tcPr>
     </w:tblStylePr>
   </w:style>
-  <w:style w:type="table" w:styleId="84">
+  <w:style w:type="table" w:styleId="779">
     <w:name w:val="List Table 3 - Accent 2"/>
-    <w:basedOn w:val="665"/>
+    <w:basedOn w:val="893"/>
     <w:uiPriority w:val="99"/>
     <w:pPr>
       <w:pBdr/>
@@ -17320,9 +18213,9 @@
       </w:tcPr>
     </w:tblStylePr>
   </w:style>
-  <w:style w:type="table" w:styleId="85">
+  <w:style w:type="table" w:styleId="780">
     <w:name w:val="List Table 3 - Accent 3"/>
-    <w:basedOn w:val="665"/>
+    <w:basedOn w:val="893"/>
     <w:uiPriority w:val="99"/>
     <w:pPr>
       <w:pBdr/>
@@ -17548,9 +18441,9 @@
       </w:tcPr>
     </w:tblStylePr>
   </w:style>
-  <w:style w:type="table" w:styleId="86">
+  <w:style w:type="table" w:styleId="781">
     <w:name w:val="List Table 3 - Accent 4"/>
-    <w:basedOn w:val="665"/>
+    <w:basedOn w:val="893"/>
     <w:uiPriority w:val="99"/>
     <w:pPr>
       <w:pBdr/>
@@ -17776,9 +18669,9 @@
       </w:tcPr>
     </w:tblStylePr>
   </w:style>
-  <w:style w:type="table" w:styleId="87">
+  <w:style w:type="table" w:styleId="782">
     <w:name w:val="List Table 3 - Accent 5"/>
-    <w:basedOn w:val="665"/>
+    <w:basedOn w:val="893"/>
     <w:uiPriority w:val="99"/>
     <w:pPr>
       <w:pBdr/>
@@ -18004,9 +18897,9 @@
       </w:tcPr>
     </w:tblStylePr>
   </w:style>
-  <w:style w:type="table" w:styleId="88">
+  <w:style w:type="table" w:styleId="783">
     <w:name w:val="List Table 3 - Accent 6"/>
-    <w:basedOn w:val="665"/>
+    <w:basedOn w:val="893"/>
     <w:uiPriority w:val="99"/>
     <w:pPr>
       <w:pBdr/>
@@ -18232,9 +19125,9 @@
       </w:tcPr>
     </w:tblStylePr>
   </w:style>
-  <w:style w:type="table" w:styleId="89">
+  <w:style w:type="table" w:styleId="784">
     <w:name w:val="List Table 4"/>
-    <w:basedOn w:val="665"/>
+    <w:basedOn w:val="893"/>
     <w:uiPriority w:val="99"/>
     <w:pPr>
       <w:pBdr/>
@@ -18457,9 +19350,9 @@
       </w:tcPr>
     </w:tblStylePr>
   </w:style>
-  <w:style w:type="table" w:styleId="90">
+  <w:style w:type="table" w:styleId="785">
     <w:name w:val="List Table 4 - Accent 1"/>
-    <w:basedOn w:val="665"/>
+    <w:basedOn w:val="893"/>
     <w:uiPriority w:val="99"/>
     <w:pPr>
       <w:pBdr/>
@@ -18682,9 +19575,9 @@
       </w:tcPr>
     </w:tblStylePr>
   </w:style>
-  <w:style w:type="table" w:styleId="91">
+  <w:style w:type="table" w:styleId="786">
     <w:name w:val="List Table 4 - Accent 2"/>
-    <w:basedOn w:val="665"/>
+    <w:basedOn w:val="893"/>
     <w:uiPriority w:val="99"/>
     <w:pPr>
       <w:pBdr/>
@@ -18907,9 +19800,9 @@
       </w:tcPr>
     </w:tblStylePr>
   </w:style>
-  <w:style w:type="table" w:styleId="92">
+  <w:style w:type="table" w:styleId="787">
     <w:name w:val="List Table 4 - Accent 3"/>
-    <w:basedOn w:val="665"/>
+    <w:basedOn w:val="893"/>
     <w:uiPriority w:val="99"/>
     <w:pPr>
       <w:pBdr/>
@@ -19132,9 +20025,9 @@
       </w:tcPr>
     </w:tblStylePr>
   </w:style>
-  <w:style w:type="table" w:styleId="93">
+  <w:style w:type="table" w:styleId="788">
     <w:name w:val="List Table 4 - Accent 4"/>
-    <w:basedOn w:val="665"/>
+    <w:basedOn w:val="893"/>
     <w:uiPriority w:val="99"/>
     <w:pPr>
       <w:pBdr/>
@@ -19357,9 +20250,9 @@
       </w:tcPr>
     </w:tblStylePr>
   </w:style>
-  <w:style w:type="table" w:styleId="94">
+  <w:style w:type="table" w:styleId="789">
     <w:name w:val="List Table 4 - Accent 5"/>
-    <w:basedOn w:val="665"/>
+    <w:basedOn w:val="893"/>
     <w:uiPriority w:val="99"/>
     <w:pPr>
       <w:pBdr/>
@@ -19582,9 +20475,9 @@
       </w:tcPr>
     </w:tblStylePr>
   </w:style>
-  <w:style w:type="table" w:styleId="95">
+  <w:style w:type="table" w:styleId="790">
     <w:name w:val="List Table 4 - Accent 6"/>
-    <w:basedOn w:val="665"/>
+    <w:basedOn w:val="893"/>
     <w:uiPriority w:val="99"/>
     <w:pPr>
       <w:pBdr/>
@@ -19807,9 +20700,9 @@
       </w:tcPr>
     </w:tblStylePr>
   </w:style>
-  <w:style w:type="table" w:styleId="96">
+  <w:style w:type="table" w:styleId="791">
     <w:name w:val="List Table 5 Dark"/>
-    <w:basedOn w:val="665"/>
+    <w:basedOn w:val="893"/>
     <w:uiPriority w:val="99"/>
     <w:pPr>
       <w:pBdr/>
@@ -20049,9 +20942,9 @@
       </w:tcPr>
     </w:tblStylePr>
   </w:style>
-  <w:style w:type="table" w:styleId="97">
+  <w:style w:type="table" w:styleId="792">
     <w:name w:val="List Table 5 Dark - Accent 1"/>
-    <w:basedOn w:val="665"/>
+    <w:basedOn w:val="893"/>
     <w:uiPriority w:val="99"/>
     <w:pPr>
       <w:pBdr/>
@@ -20291,9 +21184,9 @@
       </w:tcPr>
     </w:tblStylePr>
   </w:style>
-  <w:style w:type="table" w:styleId="98">
+  <w:style w:type="table" w:styleId="793">
     <w:name w:val="List Table 5 Dark - Accent 2"/>
-    <w:basedOn w:val="665"/>
+    <w:basedOn w:val="893"/>
     <w:uiPriority w:val="99"/>
     <w:pPr>
       <w:pBdr/>
@@ -20533,9 +21426,9 @@
       </w:tcPr>
     </w:tblStylePr>
   </w:style>
-  <w:style w:type="table" w:styleId="99">
+  <w:style w:type="table" w:styleId="794">
     <w:name w:val="List Table 5 Dark - Accent 3"/>
-    <w:basedOn w:val="665"/>
+    <w:basedOn w:val="893"/>
     <w:uiPriority w:val="99"/>
     <w:pPr>
       <w:pBdr/>
@@ -20775,9 +21668,9 @@
       </w:tcPr>
     </w:tblStylePr>
   </w:style>
-  <w:style w:type="table" w:styleId="100">
+  <w:style w:type="table" w:styleId="795">
     <w:name w:val="List Table 5 Dark - Accent 4"/>
-    <w:basedOn w:val="665"/>
+    <w:basedOn w:val="893"/>
     <w:uiPriority w:val="99"/>
     <w:pPr>
       <w:pBdr/>
@@ -21017,9 +21910,9 @@
       </w:tcPr>
     </w:tblStylePr>
   </w:style>
-  <w:style w:type="table" w:styleId="101">
+  <w:style w:type="table" w:styleId="796">
     <w:name w:val="List Table 5 Dark - Accent 5"/>
-    <w:basedOn w:val="665"/>
+    <w:basedOn w:val="893"/>
     <w:uiPriority w:val="99"/>
     <w:pPr>
       <w:pBdr/>
@@ -21259,9 +22152,9 @@
       </w:tcPr>
     </w:tblStylePr>
   </w:style>
-  <w:style w:type="table" w:styleId="102">
+  <w:style w:type="table" w:styleId="797">
     <w:name w:val="List Table 5 Dark - Accent 6"/>
-    <w:basedOn w:val="665"/>
+    <w:basedOn w:val="893"/>
     <w:uiPriority w:val="99"/>
     <w:pPr>
       <w:pBdr/>
@@ -21501,9 +22394,9 @@
       </w:tcPr>
     </w:tblStylePr>
   </w:style>
-  <w:style w:type="table" w:styleId="103">
+  <w:style w:type="table" w:styleId="798">
     <w:name w:val="List Table 6 Colorful"/>
-    <w:basedOn w:val="665"/>
+    <w:basedOn w:val="893"/>
     <w:uiPriority w:val="99"/>
     <w:pPr>
       <w:pBdr/>
@@ -21724,9 +22617,9 @@
       </w:tcPr>
     </w:tblStylePr>
   </w:style>
-  <w:style w:type="table" w:styleId="104">
+  <w:style w:type="table" w:styleId="799">
     <w:name w:val="List Table 6 Colorful - Accent 1"/>
-    <w:basedOn w:val="665"/>
+    <w:basedOn w:val="893"/>
     <w:uiPriority w:val="99"/>
     <w:pPr>
       <w:pBdr/>
@@ -21947,9 +22840,9 @@
       </w:tcPr>
     </w:tblStylePr>
   </w:style>
-  <w:style w:type="table" w:styleId="105">
+  <w:style w:type="table" w:styleId="800">
     <w:name w:val="List Table 6 Colorful - Accent 2"/>
-    <w:basedOn w:val="665"/>
+    <w:basedOn w:val="893"/>
     <w:uiPriority w:val="99"/>
     <w:pPr>
       <w:pBdr/>
@@ -22170,9 +23063,9 @@
       </w:tcPr>
     </w:tblStylePr>
   </w:style>
-  <w:style w:type="table" w:styleId="106">
+  <w:style w:type="table" w:styleId="801">
     <w:name w:val="List Table 6 Colorful - Accent 3"/>
-    <w:basedOn w:val="665"/>
+    <w:basedOn w:val="893"/>
     <w:uiPriority w:val="99"/>
     <w:pPr>
       <w:pBdr/>
@@ -22393,9 +23286,9 @@
       </w:tcPr>
     </w:tblStylePr>
   </w:style>
-  <w:style w:type="table" w:styleId="107">
+  <w:style w:type="table" w:styleId="802">
     <w:name w:val="List Table 6 Colorful - Accent 4"/>
-    <w:basedOn w:val="665"/>
+    <w:basedOn w:val="893"/>
     <w:uiPriority w:val="99"/>
     <w:pPr>
       <w:pBdr/>
@@ -22616,9 +23509,9 @@
       </w:tcPr>
     </w:tblStylePr>
   </w:style>
-  <w:style w:type="table" w:styleId="108">
+  <w:style w:type="table" w:styleId="803">
     <w:name w:val="List Table 6 Colorful - Accent 5"/>
-    <w:basedOn w:val="665"/>
+    <w:basedOn w:val="893"/>
     <w:uiPriority w:val="99"/>
     <w:pPr>
       <w:pBdr/>
@@ -22839,9 +23732,9 @@
       </w:tcPr>
     </w:tblStylePr>
   </w:style>
-  <w:style w:type="table" w:styleId="109">
+  <w:style w:type="table" w:styleId="804">
     <w:name w:val="List Table 6 Colorful - Accent 6"/>
-    <w:basedOn w:val="665"/>
+    <w:basedOn w:val="893"/>
     <w:uiPriority w:val="99"/>
     <w:pPr>
       <w:pBdr/>
@@ -23062,9 +23955,9 @@
       </w:tcPr>
     </w:tblStylePr>
   </w:style>
-  <w:style w:type="table" w:styleId="110">
+  <w:style w:type="table" w:styleId="805">
     <w:name w:val="List Table 7 Colorful"/>
-    <w:basedOn w:val="665"/>
+    <w:basedOn w:val="893"/>
     <w:uiPriority w:val="99"/>
     <w:pPr>
       <w:pBdr/>
@@ -23163,11 +24056,11 @@
         <w:tblBorders/>
       </w:tblPr>
       <w:tcPr>
-        <w:shd w:color="ffffff"/>
+        <w:shd w:val="clear" w:color="ffffff"/>
         <w:tcBorders>
-          <w:top w:val="none"/>
-          <w:left w:val="none"/>
-          <w:bottom w:val="none"/>
+          <w:top w:val="none" w:color="000000" w:sz="4" w:space="0"/>
+          <w:left w:val="none" w:color="000000" w:sz="4" w:space="0"/>
+          <w:bottom w:val="none" w:color="000000" w:sz="4" w:space="0"/>
           <w:right w:val="single" w:color="000000" w:themeColor="text1" w:themeTint="80" w:sz="4" w:space="0"/>
         </w:tcBorders>
       </w:tcPr>
@@ -23190,10 +24083,10 @@
       <w:tcPr>
         <w:shd w:val="clear" w:color="ffffff" w:themeColor="light1" w:fill="ffffff" w:themeFill="light1"/>
         <w:tcBorders>
-          <w:top w:val="none"/>
-          <w:left w:val="none"/>
+          <w:top w:val="none" w:color="000000" w:sz="4" w:space="0"/>
+          <w:left w:val="none" w:color="000000" w:sz="4" w:space="0"/>
           <w:bottom w:val="single" w:color="000000" w:themeColor="text1" w:themeTint="80" w:sz="4" w:space="0"/>
-          <w:right w:val="none"/>
+          <w:right w:val="none" w:color="000000" w:sz="4" w:space="0"/>
         </w:tcBorders>
       </w:tcPr>
     </w:tblStylePr>
@@ -23213,12 +24106,12 @@
         <w:tblBorders/>
       </w:tblPr>
       <w:tcPr>
-        <w:shd w:color="ffffff"/>
+        <w:shd w:val="clear" w:color="ffffff"/>
         <w:tcBorders>
-          <w:top w:val="none"/>
+          <w:top w:val="none" w:color="000000" w:sz="4" w:space="0"/>
           <w:left w:val="single" w:color="000000" w:themeColor="text1" w:themeTint="80" w:sz="4" w:space="0"/>
-          <w:bottom w:val="none"/>
-          <w:right w:val="none"/>
+          <w:bottom w:val="none" w:color="000000" w:sz="4" w:space="0"/>
+          <w:right w:val="none" w:color="000000" w:sz="4" w:space="0"/>
         </w:tcBorders>
       </w:tcPr>
     </w:tblStylePr>
@@ -23241,9 +24134,9 @@
         <w:shd w:val="clear" w:color="ffffff" w:themeColor="light1" w:fill="ffffff" w:themeFill="light1"/>
         <w:tcBorders>
           <w:top w:val="single" w:color="000000" w:themeColor="text1" w:themeTint="80" w:sz="4" w:space="0"/>
-          <w:left w:val="none"/>
-          <w:bottom w:val="none"/>
-          <w:right w:val="none"/>
+          <w:left w:val="none" w:color="000000" w:sz="4" w:space="0"/>
+          <w:bottom w:val="none" w:color="000000" w:sz="4" w:space="0"/>
+          <w:right w:val="none" w:color="000000" w:sz="4" w:space="0"/>
         </w:tcBorders>
       </w:tcPr>
     </w:tblStylePr>
@@ -23318,9 +24211,9 @@
       </w:tcPr>
     </w:tblStylePr>
   </w:style>
-  <w:style w:type="table" w:styleId="111">
+  <w:style w:type="table" w:styleId="806">
     <w:name w:val="List Table 7 Colorful - Accent 1"/>
-    <w:basedOn w:val="665"/>
+    <w:basedOn w:val="893"/>
     <w:uiPriority w:val="99"/>
     <w:pPr>
       <w:pBdr/>
@@ -23419,11 +24312,11 @@
         <w:tblBorders/>
       </w:tblPr>
       <w:tcPr>
-        <w:shd w:color="ffffff"/>
+        <w:shd w:val="clear" w:color="ffffff"/>
         <w:tcBorders>
-          <w:top w:val="none"/>
-          <w:left w:val="none"/>
-          <w:bottom w:val="none"/>
+          <w:top w:val="none" w:color="000000" w:sz="4" w:space="0"/>
+          <w:left w:val="none" w:color="000000" w:sz="4" w:space="0"/>
+          <w:bottom w:val="none" w:color="000000" w:sz="4" w:space="0"/>
           <w:right w:val="single" w:color="000000" w:themeColor="accent1" w:sz="4" w:space="0"/>
         </w:tcBorders>
       </w:tcPr>
@@ -23446,10 +24339,10 @@
       <w:tcPr>
         <w:shd w:val="clear" w:color="ffffff" w:themeColor="light1" w:fill="ffffff" w:themeFill="light1"/>
         <w:tcBorders>
-          <w:top w:val="none"/>
-          <w:left w:val="none"/>
+          <w:top w:val="none" w:color="000000" w:sz="4" w:space="0"/>
+          <w:left w:val="none" w:color="000000" w:sz="4" w:space="0"/>
           <w:bottom w:val="single" w:color="000000" w:themeColor="accent1" w:sz="4" w:space="0"/>
-          <w:right w:val="none"/>
+          <w:right w:val="none" w:color="000000" w:sz="4" w:space="0"/>
         </w:tcBorders>
       </w:tcPr>
     </w:tblStylePr>
@@ -23469,12 +24362,12 @@
         <w:tblBorders/>
       </w:tblPr>
       <w:tcPr>
-        <w:shd w:color="ffffff"/>
+        <w:shd w:val="clear" w:color="ffffff"/>
         <w:tcBorders>
-          <w:top w:val="none"/>
+          <w:top w:val="none" w:color="000000" w:sz="4" w:space="0"/>
           <w:left w:val="single" w:color="000000" w:themeColor="accent1" w:sz="4" w:space="0"/>
-          <w:bottom w:val="none"/>
-          <w:right w:val="none"/>
+          <w:bottom w:val="none" w:color="000000" w:sz="4" w:space="0"/>
+          <w:right w:val="none" w:color="000000" w:sz="4" w:space="0"/>
         </w:tcBorders>
       </w:tcPr>
     </w:tblStylePr>
@@ -23497,9 +24390,9 @@
         <w:shd w:val="clear" w:color="ffffff" w:themeColor="light1" w:fill="ffffff" w:themeFill="light1"/>
         <w:tcBorders>
           <w:top w:val="single" w:color="000000" w:themeColor="accent1" w:sz="4" w:space="0"/>
-          <w:left w:val="none"/>
-          <w:bottom w:val="none"/>
-          <w:right w:val="none"/>
+          <w:left w:val="none" w:color="000000" w:sz="4" w:space="0"/>
+          <w:bottom w:val="none" w:color="000000" w:sz="4" w:space="0"/>
+          <w:right w:val="none" w:color="000000" w:sz="4" w:space="0"/>
         </w:tcBorders>
       </w:tcPr>
     </w:tblStylePr>
@@ -23574,9 +24467,9 @@
       </w:tcPr>
     </w:tblStylePr>
   </w:style>
-  <w:style w:type="table" w:styleId="112">
+  <w:style w:type="table" w:styleId="807">
     <w:name w:val="List Table 7 Colorful - Accent 2"/>
-    <w:basedOn w:val="665"/>
+    <w:basedOn w:val="893"/>
     <w:uiPriority w:val="99"/>
     <w:pPr>
       <w:pBdr/>
@@ -23675,11 +24568,11 @@
         <w:tblBorders/>
       </w:tblPr>
       <w:tcPr>
-        <w:shd w:color="ffffff"/>
+        <w:shd w:val="clear" w:color="ffffff"/>
         <w:tcBorders>
-          <w:top w:val="none"/>
-          <w:left w:val="none"/>
-          <w:bottom w:val="none"/>
+          <w:top w:val="none" w:color="000000" w:sz="4" w:space="0"/>
+          <w:left w:val="none" w:color="000000" w:sz="4" w:space="0"/>
+          <w:bottom w:val="none" w:color="000000" w:sz="4" w:space="0"/>
           <w:right w:val="single" w:color="000000" w:themeColor="accent2" w:themeTint="97" w:sz="4" w:space="0"/>
         </w:tcBorders>
       </w:tcPr>
@@ -23702,10 +24595,10 @@
       <w:tcPr>
         <w:shd w:val="clear" w:color="ffffff" w:themeColor="light1" w:fill="ffffff" w:themeFill="light1"/>
         <w:tcBorders>
-          <w:top w:val="none"/>
-          <w:left w:val="none"/>
+          <w:top w:val="none" w:color="000000" w:sz="4" w:space="0"/>
+          <w:left w:val="none" w:color="000000" w:sz="4" w:space="0"/>
           <w:bottom w:val="single" w:color="000000" w:themeColor="accent2" w:themeTint="97" w:sz="4" w:space="0"/>
-          <w:right w:val="none"/>
+          <w:right w:val="none" w:color="000000" w:sz="4" w:space="0"/>
         </w:tcBorders>
       </w:tcPr>
     </w:tblStylePr>
@@ -23725,12 +24618,12 @@
         <w:tblBorders/>
       </w:tblPr>
       <w:tcPr>
-        <w:shd w:color="ffffff"/>
+        <w:shd w:val="clear" w:color="ffffff"/>
         <w:tcBorders>
-          <w:top w:val="none"/>
+          <w:top w:val="none" w:color="000000" w:sz="4" w:space="0"/>
           <w:left w:val="single" w:color="000000" w:themeColor="accent2" w:themeTint="97" w:sz="4" w:space="0"/>
-          <w:bottom w:val="none"/>
-          <w:right w:val="none"/>
+          <w:bottom w:val="none" w:color="000000" w:sz="4" w:space="0"/>
+          <w:right w:val="none" w:color="000000" w:sz="4" w:space="0"/>
         </w:tcBorders>
       </w:tcPr>
     </w:tblStylePr>
@@ -23753,9 +24646,9 @@
         <w:shd w:val="clear" w:color="ffffff" w:themeColor="light1" w:fill="ffffff" w:themeFill="light1"/>
         <w:tcBorders>
           <w:top w:val="single" w:color="000000" w:themeColor="accent2" w:themeTint="97" w:sz="4" w:space="0"/>
-          <w:left w:val="none"/>
-          <w:bottom w:val="none"/>
-          <w:right w:val="none"/>
+          <w:left w:val="none" w:color="000000" w:sz="4" w:space="0"/>
+          <w:bottom w:val="none" w:color="000000" w:sz="4" w:space="0"/>
+          <w:right w:val="none" w:color="000000" w:sz="4" w:space="0"/>
         </w:tcBorders>
       </w:tcPr>
     </w:tblStylePr>
@@ -23830,9 +24723,9 @@
       </w:tcPr>
     </w:tblStylePr>
   </w:style>
-  <w:style w:type="table" w:styleId="113">
+  <w:style w:type="table" w:styleId="808">
     <w:name w:val="List Table 7 Colorful - Accent 3"/>
-    <w:basedOn w:val="665"/>
+    <w:basedOn w:val="893"/>
     <w:uiPriority w:val="99"/>
     <w:pPr>
       <w:pBdr/>
@@ -23931,11 +24824,11 @@
         <w:tblBorders/>
       </w:tblPr>
       <w:tcPr>
-        <w:shd w:color="ffffff"/>
+        <w:shd w:val="clear" w:color="ffffff"/>
         <w:tcBorders>
-          <w:top w:val="none"/>
-          <w:left w:val="none"/>
-          <w:bottom w:val="none"/>
+          <w:top w:val="none" w:color="000000" w:sz="4" w:space="0"/>
+          <w:left w:val="none" w:color="000000" w:sz="4" w:space="0"/>
+          <w:bottom w:val="none" w:color="000000" w:sz="4" w:space="0"/>
           <w:right w:val="single" w:color="000000" w:themeColor="accent3" w:themeTint="98" w:sz="4" w:space="0"/>
         </w:tcBorders>
       </w:tcPr>
@@ -23958,10 +24851,10 @@
       <w:tcPr>
         <w:shd w:val="clear" w:color="ffffff" w:themeColor="light1" w:fill="ffffff" w:themeFill="light1"/>
         <w:tcBorders>
-          <w:top w:val="none"/>
-          <w:left w:val="none"/>
+          <w:top w:val="none" w:color="000000" w:sz="4" w:space="0"/>
+          <w:left w:val="none" w:color="000000" w:sz="4" w:space="0"/>
           <w:bottom w:val="single" w:color="000000" w:themeColor="accent3" w:themeTint="98" w:sz="4" w:space="0"/>
-          <w:right w:val="none"/>
+          <w:right w:val="none" w:color="000000" w:sz="4" w:space="0"/>
         </w:tcBorders>
       </w:tcPr>
     </w:tblStylePr>
@@ -23981,12 +24874,12 @@
         <w:tblBorders/>
       </w:tblPr>
       <w:tcPr>
-        <w:shd w:color="ffffff"/>
+        <w:shd w:val="clear" w:color="ffffff"/>
         <w:tcBorders>
-          <w:top w:val="none"/>
+          <w:top w:val="none" w:color="000000" w:sz="4" w:space="0"/>
           <w:left w:val="single" w:color="000000" w:themeColor="accent3" w:themeTint="98" w:sz="4" w:space="0"/>
-          <w:bottom w:val="none"/>
-          <w:right w:val="none"/>
+          <w:bottom w:val="none" w:color="000000" w:sz="4" w:space="0"/>
+          <w:right w:val="none" w:color="000000" w:sz="4" w:space="0"/>
         </w:tcBorders>
       </w:tcPr>
     </w:tblStylePr>
@@ -24009,9 +24902,9 @@
         <w:shd w:val="clear" w:color="ffffff" w:themeColor="light1" w:fill="ffffff" w:themeFill="light1"/>
         <w:tcBorders>
           <w:top w:val="single" w:color="000000" w:themeColor="accent3" w:themeTint="98" w:sz="4" w:space="0"/>
-          <w:left w:val="none"/>
-          <w:bottom w:val="none"/>
-          <w:right w:val="none"/>
+          <w:left w:val="none" w:color="000000" w:sz="4" w:space="0"/>
+          <w:bottom w:val="none" w:color="000000" w:sz="4" w:space="0"/>
+          <w:right w:val="none" w:color="000000" w:sz="4" w:space="0"/>
         </w:tcBorders>
       </w:tcPr>
     </w:tblStylePr>
@@ -24086,9 +24979,9 @@
       </w:tcPr>
     </w:tblStylePr>
   </w:style>
-  <w:style w:type="table" w:styleId="114">
+  <w:style w:type="table" w:styleId="809">
     <w:name w:val="List Table 7 Colorful - Accent 4"/>
-    <w:basedOn w:val="665"/>
+    <w:basedOn w:val="893"/>
     <w:uiPriority w:val="99"/>
     <w:pPr>
       <w:pBdr/>
@@ -24187,11 +25080,11 @@
         <w:tblBorders/>
       </w:tblPr>
       <w:tcPr>
-        <w:shd w:color="ffffff"/>
+        <w:shd w:val="clear" w:color="ffffff"/>
         <w:tcBorders>
-          <w:top w:val="none"/>
-          <w:left w:val="none"/>
-          <w:bottom w:val="none"/>
+          <w:top w:val="none" w:color="000000" w:sz="4" w:space="0"/>
+          <w:left w:val="none" w:color="000000" w:sz="4" w:space="0"/>
+          <w:bottom w:val="none" w:color="000000" w:sz="4" w:space="0"/>
           <w:right w:val="single" w:color="000000" w:themeColor="accent4" w:themeTint="9A" w:sz="4" w:space="0"/>
         </w:tcBorders>
       </w:tcPr>
@@ -24214,10 +25107,10 @@
       <w:tcPr>
         <w:shd w:val="clear" w:color="ffffff" w:themeColor="light1" w:fill="ffffff" w:themeFill="light1"/>
         <w:tcBorders>
-          <w:top w:val="none"/>
-          <w:left w:val="none"/>
+          <w:top w:val="none" w:color="000000" w:sz="4" w:space="0"/>
+          <w:left w:val="none" w:color="000000" w:sz="4" w:space="0"/>
           <w:bottom w:val="single" w:color="000000" w:themeColor="accent4" w:themeTint="9A" w:sz="4" w:space="0"/>
-          <w:right w:val="none"/>
+          <w:right w:val="none" w:color="000000" w:sz="4" w:space="0"/>
         </w:tcBorders>
       </w:tcPr>
     </w:tblStylePr>
@@ -24237,12 +25130,12 @@
         <w:tblBorders/>
       </w:tblPr>
       <w:tcPr>
-        <w:shd w:color="ffffff"/>
+        <w:shd w:val="clear" w:color="ffffff"/>
         <w:tcBorders>
-          <w:top w:val="none"/>
+          <w:top w:val="none" w:color="000000" w:sz="4" w:space="0"/>
           <w:left w:val="single" w:color="000000" w:themeColor="accent4" w:themeTint="9A" w:sz="4" w:space="0"/>
-          <w:bottom w:val="none"/>
-          <w:right w:val="none"/>
+          <w:bottom w:val="none" w:color="000000" w:sz="4" w:space="0"/>
+          <w:right w:val="none" w:color="000000" w:sz="4" w:space="0"/>
         </w:tcBorders>
       </w:tcPr>
     </w:tblStylePr>
@@ -24265,9 +25158,9 @@
         <w:shd w:val="clear" w:color="ffffff" w:themeColor="light1" w:fill="ffffff" w:themeFill="light1"/>
         <w:tcBorders>
           <w:top w:val="single" w:color="000000" w:themeColor="accent4" w:themeTint="9A" w:sz="4" w:space="0"/>
-          <w:left w:val="none"/>
-          <w:bottom w:val="none"/>
-          <w:right w:val="none"/>
+          <w:left w:val="none" w:color="000000" w:sz="4" w:space="0"/>
+          <w:bottom w:val="none" w:color="000000" w:sz="4" w:space="0"/>
+          <w:right w:val="none" w:color="000000" w:sz="4" w:space="0"/>
         </w:tcBorders>
       </w:tcPr>
     </w:tblStylePr>
@@ -24342,9 +25235,9 @@
       </w:tcPr>
     </w:tblStylePr>
   </w:style>
-  <w:style w:type="table" w:styleId="115">
+  <w:style w:type="table" w:styleId="810">
     <w:name w:val="List Table 7 Colorful - Accent 5"/>
-    <w:basedOn w:val="665"/>
+    <w:basedOn w:val="893"/>
     <w:uiPriority w:val="99"/>
     <w:pPr>
       <w:pBdr/>
@@ -24443,11 +25336,11 @@
         <w:tblBorders/>
       </w:tblPr>
       <w:tcPr>
-        <w:shd w:color="ffffff"/>
+        <w:shd w:val="clear" w:color="ffffff"/>
         <w:tcBorders>
-          <w:top w:val="none"/>
-          <w:left w:val="none"/>
-          <w:bottom w:val="none"/>
+          <w:top w:val="none" w:color="000000" w:sz="4" w:space="0"/>
+          <w:left w:val="none" w:color="000000" w:sz="4" w:space="0"/>
+          <w:bottom w:val="none" w:color="000000" w:sz="4" w:space="0"/>
           <w:right w:val="single" w:color="000000" w:themeColor="accent5" w:themeTint="9A" w:sz="4" w:space="0"/>
         </w:tcBorders>
       </w:tcPr>
@@ -24470,10 +25363,10 @@
       <w:tcPr>
         <w:shd w:val="clear" w:color="ffffff" w:themeColor="light1" w:fill="ffffff" w:themeFill="light1"/>
         <w:tcBorders>
-          <w:top w:val="none"/>
-          <w:left w:val="none"/>
+          <w:top w:val="none" w:color="000000" w:sz="4" w:space="0"/>
+          <w:left w:val="none" w:color="000000" w:sz="4" w:space="0"/>
           <w:bottom w:val="single" w:color="000000" w:themeColor="accent5" w:themeTint="9A" w:sz="4" w:space="0"/>
-          <w:right w:val="none"/>
+          <w:right w:val="none" w:color="000000" w:sz="4" w:space="0"/>
         </w:tcBorders>
       </w:tcPr>
     </w:tblStylePr>
@@ -24493,12 +25386,12 @@
         <w:tblBorders/>
       </w:tblPr>
       <w:tcPr>
-        <w:shd w:color="ffffff"/>
+        <w:shd w:val="clear" w:color="ffffff"/>
         <w:tcBorders>
-          <w:top w:val="none"/>
+          <w:top w:val="none" w:color="000000" w:sz="4" w:space="0"/>
           <w:left w:val="single" w:color="000000" w:themeColor="accent5" w:themeTint="9A" w:sz="4" w:space="0"/>
-          <w:bottom w:val="none"/>
-          <w:right w:val="none"/>
+          <w:bottom w:val="none" w:color="000000" w:sz="4" w:space="0"/>
+          <w:right w:val="none" w:color="000000" w:sz="4" w:space="0"/>
         </w:tcBorders>
       </w:tcPr>
     </w:tblStylePr>
@@ -24521,9 +25414,9 @@
         <w:shd w:val="clear" w:color="ffffff" w:themeColor="light1" w:fill="ffffff" w:themeFill="light1"/>
         <w:tcBorders>
           <w:top w:val="single" w:color="000000" w:themeColor="accent5" w:themeTint="9A" w:sz="4" w:space="0"/>
-          <w:left w:val="none"/>
-          <w:bottom w:val="none"/>
-          <w:right w:val="none"/>
+          <w:left w:val="none" w:color="000000" w:sz="4" w:space="0"/>
+          <w:bottom w:val="none" w:color="000000" w:sz="4" w:space="0"/>
+          <w:right w:val="none" w:color="000000" w:sz="4" w:space="0"/>
         </w:tcBorders>
       </w:tcPr>
     </w:tblStylePr>
@@ -24598,9 +25491,9 @@
       </w:tcPr>
     </w:tblStylePr>
   </w:style>
-  <w:style w:type="table" w:styleId="116">
+  <w:style w:type="table" w:styleId="811">
     <w:name w:val="List Table 7 Colorful - Accent 6"/>
-    <w:basedOn w:val="665"/>
+    <w:basedOn w:val="893"/>
     <w:uiPriority w:val="99"/>
     <w:pPr>
       <w:pBdr/>
@@ -24699,11 +25592,11 @@
         <w:tblBorders/>
       </w:tblPr>
       <w:tcPr>
-        <w:shd w:color="ffffff"/>
+        <w:shd w:val="clear" w:color="ffffff"/>
         <w:tcBorders>
-          <w:top w:val="none"/>
-          <w:left w:val="none"/>
-          <w:bottom w:val="none"/>
+          <w:top w:val="none" w:color="000000" w:sz="4" w:space="0"/>
+          <w:left w:val="none" w:color="000000" w:sz="4" w:space="0"/>
+          <w:bottom w:val="none" w:color="000000" w:sz="4" w:space="0"/>
           <w:right w:val="single" w:color="000000" w:themeColor="accent6" w:themeTint="98" w:sz="4" w:space="0"/>
         </w:tcBorders>
       </w:tcPr>
@@ -24726,10 +25619,10 @@
       <w:tcPr>
         <w:shd w:val="clear" w:color="ffffff" w:themeColor="light1" w:fill="ffffff" w:themeFill="light1"/>
         <w:tcBorders>
-          <w:top w:val="none"/>
-          <w:left w:val="none"/>
+          <w:top w:val="none" w:color="000000" w:sz="4" w:space="0"/>
+          <w:left w:val="none" w:color="000000" w:sz="4" w:space="0"/>
           <w:bottom w:val="single" w:color="000000" w:themeColor="accent6" w:themeTint="98" w:sz="4" w:space="0"/>
-          <w:right w:val="none"/>
+          <w:right w:val="none" w:color="000000" w:sz="4" w:space="0"/>
         </w:tcBorders>
       </w:tcPr>
     </w:tblStylePr>
@@ -24749,12 +25642,12 @@
         <w:tblBorders/>
       </w:tblPr>
       <w:tcPr>
-        <w:shd w:color="ffffff"/>
+        <w:shd w:val="clear" w:color="ffffff"/>
         <w:tcBorders>
-          <w:top w:val="none"/>
+          <w:top w:val="none" w:color="000000" w:sz="4" w:space="0"/>
           <w:left w:val="single" w:color="000000" w:themeColor="accent6" w:themeTint="98" w:sz="4" w:space="0"/>
-          <w:bottom w:val="none"/>
-          <w:right w:val="none"/>
+          <w:bottom w:val="none" w:color="000000" w:sz="4" w:space="0"/>
+          <w:right w:val="none" w:color="000000" w:sz="4" w:space="0"/>
         </w:tcBorders>
       </w:tcPr>
     </w:tblStylePr>
@@ -24777,9 +25670,9 @@
         <w:shd w:val="clear" w:color="ffffff" w:themeColor="light1" w:fill="ffffff" w:themeFill="light1"/>
         <w:tcBorders>
           <w:top w:val="single" w:color="000000" w:themeColor="accent6" w:themeTint="98" w:sz="4" w:space="0"/>
-          <w:left w:val="none"/>
-          <w:bottom w:val="none"/>
-          <w:right w:val="none"/>
+          <w:left w:val="none" w:color="000000" w:sz="4" w:space="0"/>
+          <w:bottom w:val="none" w:color="000000" w:sz="4" w:space="0"/>
+          <w:right w:val="none" w:color="000000" w:sz="4" w:space="0"/>
         </w:tcBorders>
       </w:tcPr>
     </w:tblStylePr>
@@ -24854,9 +25747,9 @@
       </w:tcPr>
     </w:tblStylePr>
   </w:style>
-  <w:style w:type="table" w:styleId="117">
+  <w:style w:type="table" w:styleId="812">
     <w:name w:val="Lined - Accent"/>
-    <w:basedOn w:val="665"/>
+    <w:basedOn w:val="893"/>
     <w:uiPriority w:val="99"/>
     <w:pPr>
       <w:pBdr/>
@@ -25091,9 +25984,9 @@
       </w:tcPr>
     </w:tblStylePr>
   </w:style>
-  <w:style w:type="table" w:styleId="118">
+  <w:style w:type="table" w:styleId="813">
     <w:name w:val="Lined - Accent 1"/>
-    <w:basedOn w:val="665"/>
+    <w:basedOn w:val="893"/>
     <w:uiPriority w:val="99"/>
     <w:pPr>
       <w:pBdr/>
@@ -25328,9 +26221,9 @@
       </w:tcPr>
     </w:tblStylePr>
   </w:style>
-  <w:style w:type="table" w:styleId="119">
+  <w:style w:type="table" w:styleId="814">
     <w:name w:val="Lined - Accent 2"/>
-    <w:basedOn w:val="665"/>
+    <w:basedOn w:val="893"/>
     <w:uiPriority w:val="99"/>
     <w:pPr>
       <w:pBdr/>
@@ -25565,9 +26458,9 @@
       </w:tcPr>
     </w:tblStylePr>
   </w:style>
-  <w:style w:type="table" w:styleId="120">
+  <w:style w:type="table" w:styleId="815">
     <w:name w:val="Lined - Accent 3"/>
-    <w:basedOn w:val="665"/>
+    <w:basedOn w:val="893"/>
     <w:uiPriority w:val="99"/>
     <w:pPr>
       <w:pBdr/>
@@ -25802,9 +26695,9 @@
       </w:tcPr>
     </w:tblStylePr>
   </w:style>
-  <w:style w:type="table" w:styleId="121">
+  <w:style w:type="table" w:styleId="816">
     <w:name w:val="Lined - Accent 4"/>
-    <w:basedOn w:val="665"/>
+    <w:basedOn w:val="893"/>
     <w:uiPriority w:val="99"/>
     <w:pPr>
       <w:pBdr/>
@@ -26039,9 +26932,9 @@
       </w:tcPr>
     </w:tblStylePr>
   </w:style>
-  <w:style w:type="table" w:styleId="122">
+  <w:style w:type="table" w:styleId="817">
     <w:name w:val="Lined - Accent 5"/>
-    <w:basedOn w:val="665"/>
+    <w:basedOn w:val="893"/>
     <w:uiPriority w:val="99"/>
     <w:pPr>
       <w:pBdr/>
@@ -26276,9 +27169,9 @@
       </w:tcPr>
     </w:tblStylePr>
   </w:style>
-  <w:style w:type="table" w:styleId="123">
+  <w:style w:type="table" w:styleId="818">
     <w:name w:val="Lined - Accent 6"/>
-    <w:basedOn w:val="665"/>
+    <w:basedOn w:val="893"/>
     <w:uiPriority w:val="99"/>
     <w:pPr>
       <w:pBdr/>
@@ -26513,9 +27406,9 @@
       </w:tcPr>
     </w:tblStylePr>
   </w:style>
-  <w:style w:type="table" w:styleId="124">
+  <w:style w:type="table" w:styleId="819">
     <w:name w:val="Bordered &amp; Lined - Accent"/>
-    <w:basedOn w:val="665"/>
+    <w:basedOn w:val="893"/>
     <w:uiPriority w:val="99"/>
     <w:pPr>
       <w:pBdr/>
@@ -26757,9 +27650,9 @@
       </w:tcPr>
     </w:tblStylePr>
   </w:style>
-  <w:style w:type="table" w:styleId="125">
+  <w:style w:type="table" w:styleId="820">
     <w:name w:val="Bordered &amp; Lined - Accent 1"/>
-    <w:basedOn w:val="665"/>
+    <w:basedOn w:val="893"/>
     <w:uiPriority w:val="99"/>
     <w:pPr>
       <w:pBdr/>
@@ -27001,9 +27894,9 @@
       </w:tcPr>
     </w:tblStylePr>
   </w:style>
-  <w:style w:type="table" w:styleId="126">
+  <w:style w:type="table" w:styleId="821">
     <w:name w:val="Bordered &amp; Lined - Accent 2"/>
-    <w:basedOn w:val="665"/>
+    <w:basedOn w:val="893"/>
     <w:uiPriority w:val="99"/>
     <w:pPr>
       <w:pBdr/>
@@ -27245,9 +28138,9 @@
       </w:tcPr>
     </w:tblStylePr>
   </w:style>
-  <w:style w:type="table" w:styleId="127">
+  <w:style w:type="table" w:styleId="822">
     <w:name w:val="Bordered &amp; Lined - Accent 3"/>
-    <w:basedOn w:val="665"/>
+    <w:basedOn w:val="893"/>
     <w:uiPriority w:val="99"/>
     <w:pPr>
       <w:pBdr/>
@@ -27489,9 +28382,9 @@
       </w:tcPr>
     </w:tblStylePr>
   </w:style>
-  <w:style w:type="table" w:styleId="128">
+  <w:style w:type="table" w:styleId="823">
     <w:name w:val="Bordered &amp; Lined - Accent 4"/>
-    <w:basedOn w:val="665"/>
+    <w:basedOn w:val="893"/>
     <w:uiPriority w:val="99"/>
     <w:pPr>
       <w:pBdr/>
@@ -27733,9 +28626,9 @@
       </w:tcPr>
     </w:tblStylePr>
   </w:style>
-  <w:style w:type="table" w:styleId="129">
+  <w:style w:type="table" w:styleId="824">
     <w:name w:val="Bordered &amp; Lined - Accent 5"/>
-    <w:basedOn w:val="665"/>
+    <w:basedOn w:val="893"/>
     <w:uiPriority w:val="99"/>
     <w:pPr>
       <w:pBdr/>
@@ -27977,9 +28870,9 @@
       </w:tcPr>
     </w:tblStylePr>
   </w:style>
-  <w:style w:type="table" w:styleId="130">
+  <w:style w:type="table" w:styleId="825">
     <w:name w:val="Bordered &amp; Lined - Accent 6"/>
-    <w:basedOn w:val="665"/>
+    <w:basedOn w:val="893"/>
     <w:uiPriority w:val="99"/>
     <w:pPr>
       <w:pBdr/>
@@ -28221,9 +29114,9 @@
       </w:tcPr>
     </w:tblStylePr>
   </w:style>
-  <w:style w:type="table" w:styleId="131">
+  <w:style w:type="table" w:styleId="826">
     <w:name w:val="Bordered"/>
-    <w:basedOn w:val="665"/>
+    <w:basedOn w:val="893"/>
     <w:uiPriority w:val="99"/>
     <w:pPr>
       <w:pBdr/>
@@ -28452,9 +29345,9 @@
       </w:tcPr>
     </w:tblStylePr>
   </w:style>
-  <w:style w:type="table" w:styleId="132">
+  <w:style w:type="table" w:styleId="827">
     <w:name w:val="Bordered - Accent 1"/>
-    <w:basedOn w:val="665"/>
+    <w:basedOn w:val="893"/>
     <w:uiPriority w:val="99"/>
     <w:pPr>
       <w:pBdr/>
@@ -28683,9 +29576,9 @@
       </w:tcPr>
     </w:tblStylePr>
   </w:style>
-  <w:style w:type="table" w:styleId="133">
+  <w:style w:type="table" w:styleId="828">
     <w:name w:val="Bordered - Accent 2"/>
-    <w:basedOn w:val="665"/>
+    <w:basedOn w:val="893"/>
     <w:uiPriority w:val="99"/>
     <w:pPr>
       <w:pBdr/>
@@ -28914,9 +29807,9 @@
       </w:tcPr>
     </w:tblStylePr>
   </w:style>
-  <w:style w:type="table" w:styleId="134">
+  <w:style w:type="table" w:styleId="829">
     <w:name w:val="Bordered - Accent 3"/>
-    <w:basedOn w:val="665"/>
+    <w:basedOn w:val="893"/>
     <w:uiPriority w:val="99"/>
     <w:pPr>
       <w:pBdr/>
@@ -29145,9 +30038,9 @@
       </w:tcPr>
     </w:tblStylePr>
   </w:style>
-  <w:style w:type="table" w:styleId="135">
+  <w:style w:type="table" w:styleId="830">
     <w:name w:val="Bordered - Accent 4"/>
-    <w:basedOn w:val="665"/>
+    <w:basedOn w:val="893"/>
     <w:uiPriority w:val="99"/>
     <w:pPr>
       <w:pBdr/>
@@ -29376,9 +30269,9 @@
       </w:tcPr>
     </w:tblStylePr>
   </w:style>
-  <w:style w:type="table" w:styleId="136">
+  <w:style w:type="table" w:styleId="831">
     <w:name w:val="Bordered - Accent 5"/>
-    <w:basedOn w:val="665"/>
+    <w:basedOn w:val="893"/>
     <w:uiPriority w:val="99"/>
     <w:pPr>
       <w:pBdr/>
@@ -29607,9 +30500,9 @@
       </w:tcPr>
     </w:tblStylePr>
   </w:style>
-  <w:style w:type="table" w:styleId="137">
+  <w:style w:type="table" w:styleId="832">
     <w:name w:val="Bordered - Accent 6"/>
-    <w:basedOn w:val="665"/>
+    <w:basedOn w:val="893"/>
     <w:uiPriority w:val="99"/>
     <w:pPr>
       <w:pBdr/>
@@ -29838,11 +30731,11 @@
       </w:tcPr>
     </w:tblStylePr>
   </w:style>
-  <w:style w:type="paragraph" w:styleId="139">
+  <w:style w:type="paragraph" w:styleId="833">
     <w:name w:val="Heading 1"/>
-    <w:basedOn w:val="664"/>
-    <w:next w:val="664"/>
-    <w:link w:val="150"/>
+    <w:basedOn w:val="892"/>
+    <w:next w:val="892"/>
+    <w:link w:val="843"/>
     <w:uiPriority w:val="9"/>
     <w:qFormat/>
     <w:pPr>
@@ -29860,11 +30753,11 @@
       <w:szCs w:val="40"/>
     </w:rPr>
   </w:style>
-  <w:style w:type="paragraph" w:styleId="140">
+  <w:style w:type="paragraph" w:styleId="834">
     <w:name w:val="Heading 2"/>
-    <w:basedOn w:val="664"/>
-    <w:next w:val="664"/>
-    <w:link w:val="151"/>
+    <w:basedOn w:val="892"/>
+    <w:next w:val="892"/>
+    <w:link w:val="844"/>
     <w:uiPriority w:val="9"/>
     <w:unhideWhenUsed/>
     <w:qFormat/>
@@ -29883,11 +30776,11 @@
       <w:szCs w:val="32"/>
     </w:rPr>
   </w:style>
-  <w:style w:type="paragraph" w:styleId="141">
+  <w:style w:type="paragraph" w:styleId="835">
     <w:name w:val="Heading 3"/>
-    <w:basedOn w:val="664"/>
-    <w:next w:val="664"/>
-    <w:link w:val="152"/>
+    <w:basedOn w:val="892"/>
+    <w:next w:val="892"/>
+    <w:link w:val="845"/>
     <w:uiPriority w:val="9"/>
     <w:unhideWhenUsed/>
     <w:qFormat/>
@@ -29906,11 +30799,11 @@
       <w:szCs w:val="28"/>
     </w:rPr>
   </w:style>
-  <w:style w:type="paragraph" w:styleId="142">
+  <w:style w:type="paragraph" w:styleId="836">
     <w:name w:val="Heading 4"/>
-    <w:basedOn w:val="664"/>
-    <w:next w:val="664"/>
-    <w:link w:val="153"/>
+    <w:basedOn w:val="892"/>
+    <w:next w:val="892"/>
+    <w:link w:val="846"/>
     <w:uiPriority w:val="9"/>
     <w:unhideWhenUsed/>
     <w:qFormat/>
@@ -29929,11 +30822,11 @@
       <w:color w:val="0f4761" w:themeColor="accent1" w:themeShade="BF"/>
     </w:rPr>
   </w:style>
-  <w:style w:type="paragraph" w:styleId="143">
+  <w:style w:type="paragraph" w:styleId="837">
     <w:name w:val="Heading 5"/>
-    <w:basedOn w:val="664"/>
-    <w:next w:val="664"/>
-    <w:link w:val="154"/>
+    <w:basedOn w:val="892"/>
+    <w:next w:val="892"/>
+    <w:link w:val="847"/>
     <w:uiPriority w:val="9"/>
     <w:unhideWhenUsed/>
     <w:qFormat/>
@@ -29950,11 +30843,11 @@
       <w:color w:val="0f4761" w:themeColor="accent1" w:themeShade="BF"/>
     </w:rPr>
   </w:style>
-  <w:style w:type="paragraph" w:styleId="144">
+  <w:style w:type="paragraph" w:styleId="838">
     <w:name w:val="Heading 6"/>
-    <w:basedOn w:val="664"/>
-    <w:next w:val="664"/>
-    <w:link w:val="155"/>
+    <w:basedOn w:val="892"/>
+    <w:next w:val="892"/>
+    <w:link w:val="848"/>
     <w:uiPriority w:val="9"/>
     <w:unhideWhenUsed/>
     <w:qFormat/>
@@ -29973,11 +30866,11 @@
       <w:color w:val="595959" w:themeColor="text1" w:themeTint="A6"/>
     </w:rPr>
   </w:style>
-  <w:style w:type="paragraph" w:styleId="145">
+  <w:style w:type="paragraph" w:styleId="839">
     <w:name w:val="Heading 7"/>
-    <w:basedOn w:val="664"/>
-    <w:next w:val="664"/>
-    <w:link w:val="156"/>
+    <w:basedOn w:val="892"/>
+    <w:next w:val="892"/>
+    <w:link w:val="849"/>
     <w:uiPriority w:val="9"/>
     <w:unhideWhenUsed/>
     <w:qFormat/>
@@ -29994,11 +30887,11 @@
       <w:color w:val="595959" w:themeColor="text1" w:themeTint="A6"/>
     </w:rPr>
   </w:style>
-  <w:style w:type="paragraph" w:styleId="146">
+  <w:style w:type="paragraph" w:styleId="840">
     <w:name w:val="Heading 8"/>
-    <w:basedOn w:val="664"/>
-    <w:next w:val="664"/>
-    <w:link w:val="157"/>
+    <w:basedOn w:val="892"/>
+    <w:next w:val="892"/>
+    <w:link w:val="850"/>
     <w:uiPriority w:val="9"/>
     <w:unhideWhenUsed/>
     <w:qFormat/>
@@ -30017,11 +30910,11 @@
       <w:color w:val="272727" w:themeColor="text1" w:themeTint="D8"/>
     </w:rPr>
   </w:style>
-  <w:style w:type="paragraph" w:styleId="147">
+  <w:style w:type="paragraph" w:styleId="841">
     <w:name w:val="Heading 9"/>
-    <w:basedOn w:val="664"/>
-    <w:next w:val="664"/>
-    <w:link w:val="158"/>
+    <w:basedOn w:val="892"/>
+    <w:next w:val="892"/>
+    <w:link w:val="851"/>
     <w:uiPriority w:val="9"/>
     <w:unhideWhenUsed/>
     <w:qFormat/>
@@ -30040,7 +30933,7 @@
       <w:color w:val="272727" w:themeColor="text1" w:themeTint="D8"/>
     </w:rPr>
   </w:style>
-  <w:style w:type="character" w:styleId="148" w:default="1">
+  <w:style w:type="character" w:styleId="842" w:default="1">
     <w:name w:val="Default Paragraph Font"/>
     <w:uiPriority w:val="1"/>
     <w:semiHidden/>
@@ -30051,10 +30944,10 @@
       <w:ind/>
     </w:pPr>
   </w:style>
-  <w:style w:type="character" w:styleId="150">
+  <w:style w:type="character" w:styleId="843">
     <w:name w:val="Heading 1 Char"/>
-    <w:basedOn w:val="148"/>
-    <w:link w:val="139"/>
+    <w:basedOn w:val="842"/>
+    <w:link w:val="833"/>
     <w:uiPriority w:val="9"/>
     <w:pPr>
       <w:pBdr/>
@@ -30068,10 +30961,10 @@
       <w:szCs w:val="40"/>
     </w:rPr>
   </w:style>
-  <w:style w:type="character" w:styleId="151">
+  <w:style w:type="character" w:styleId="844">
     <w:name w:val="Heading 2 Char"/>
-    <w:basedOn w:val="148"/>
-    <w:link w:val="140"/>
+    <w:basedOn w:val="842"/>
+    <w:link w:val="834"/>
     <w:uiPriority w:val="9"/>
     <w:pPr>
       <w:pBdr/>
@@ -30085,10 +30978,10 @@
       <w:szCs w:val="32"/>
     </w:rPr>
   </w:style>
-  <w:style w:type="character" w:styleId="152">
+  <w:style w:type="character" w:styleId="845">
     <w:name w:val="Heading 3 Char"/>
-    <w:basedOn w:val="148"/>
-    <w:link w:val="141"/>
+    <w:basedOn w:val="842"/>
+    <w:link w:val="835"/>
     <w:uiPriority w:val="9"/>
     <w:pPr>
       <w:pBdr/>
@@ -30102,10 +30995,10 @@
       <w:szCs w:val="28"/>
     </w:rPr>
   </w:style>
-  <w:style w:type="character" w:styleId="153">
+  <w:style w:type="character" w:styleId="846">
     <w:name w:val="Heading 4 Char"/>
-    <w:basedOn w:val="148"/>
-    <w:link w:val="142"/>
+    <w:basedOn w:val="842"/>
+    <w:link w:val="836"/>
     <w:uiPriority w:val="9"/>
     <w:pPr>
       <w:pBdr/>
@@ -30119,10 +31012,10 @@
       <w:color w:val="0f4761" w:themeColor="accent1" w:themeShade="BF"/>
     </w:rPr>
   </w:style>
-  <w:style w:type="character" w:styleId="154">
+  <w:style w:type="character" w:styleId="847">
     <w:name w:val="Heading 5 Char"/>
-    <w:basedOn w:val="148"/>
-    <w:link w:val="143"/>
+    <w:basedOn w:val="842"/>
+    <w:link w:val="837"/>
     <w:uiPriority w:val="9"/>
     <w:pPr>
       <w:pBdr/>
@@ -30134,10 +31027,10 @@
       <w:color w:val="0f4761" w:themeColor="accent1" w:themeShade="BF"/>
     </w:rPr>
   </w:style>
-  <w:style w:type="character" w:styleId="155">
+  <w:style w:type="character" w:styleId="848">
     <w:name w:val="Heading 6 Char"/>
-    <w:basedOn w:val="148"/>
-    <w:link w:val="144"/>
+    <w:basedOn w:val="842"/>
+    <w:link w:val="838"/>
     <w:uiPriority w:val="9"/>
     <w:pPr>
       <w:pBdr/>
@@ -30151,10 +31044,10 @@
       <w:color w:val="595959" w:themeColor="text1" w:themeTint="A6"/>
     </w:rPr>
   </w:style>
-  <w:style w:type="character" w:styleId="156">
+  <w:style w:type="character" w:styleId="849">
     <w:name w:val="Heading 7 Char"/>
-    <w:basedOn w:val="148"/>
-    <w:link w:val="145"/>
+    <w:basedOn w:val="842"/>
+    <w:link w:val="839"/>
     <w:uiPriority w:val="9"/>
     <w:pPr>
       <w:pBdr/>
@@ -30166,10 +31059,10 @@
       <w:color w:val="595959" w:themeColor="text1" w:themeTint="A6"/>
     </w:rPr>
   </w:style>
-  <w:style w:type="character" w:styleId="157">
+  <w:style w:type="character" w:styleId="850">
     <w:name w:val="Heading 8 Char"/>
-    <w:basedOn w:val="148"/>
-    <w:link w:val="146"/>
+    <w:basedOn w:val="842"/>
+    <w:link w:val="840"/>
     <w:uiPriority w:val="9"/>
     <w:pPr>
       <w:pBdr/>
@@ -30183,10 +31076,10 @@
       <w:color w:val="272727" w:themeColor="text1" w:themeTint="D8"/>
     </w:rPr>
   </w:style>
-  <w:style w:type="character" w:styleId="158">
+  <w:style w:type="character" w:styleId="851">
     <w:name w:val="Heading 9 Char"/>
-    <w:basedOn w:val="148"/>
-    <w:link w:val="147"/>
+    <w:basedOn w:val="842"/>
+    <w:link w:val="841"/>
     <w:uiPriority w:val="9"/>
     <w:pPr>
       <w:pBdr/>
@@ -30200,11 +31093,11 @@
       <w:color w:val="272727" w:themeColor="text1" w:themeTint="D8"/>
     </w:rPr>
   </w:style>
-  <w:style w:type="paragraph" w:styleId="159">
+  <w:style w:type="paragraph" w:styleId="852">
     <w:name w:val="Title"/>
-    <w:basedOn w:val="664"/>
-    <w:next w:val="664"/>
-    <w:link w:val="160"/>
+    <w:basedOn w:val="892"/>
+    <w:next w:val="892"/>
+    <w:link w:val="853"/>
     <w:uiPriority w:val="10"/>
     <w:qFormat/>
     <w:pPr>
@@ -30220,10 +31113,10 @@
       <w:szCs w:val="56"/>
     </w:rPr>
   </w:style>
-  <w:style w:type="character" w:styleId="160">
+  <w:style w:type="character" w:styleId="853">
     <w:name w:val="Title Char"/>
-    <w:basedOn w:val="148"/>
-    <w:link w:val="159"/>
+    <w:basedOn w:val="842"/>
+    <w:link w:val="852"/>
     <w:uiPriority w:val="10"/>
     <w:pPr>
       <w:pBdr/>
@@ -30237,11 +31130,11 @@
       <w:szCs w:val="56"/>
     </w:rPr>
   </w:style>
-  <w:style w:type="paragraph" w:styleId="161">
+  <w:style w:type="paragraph" w:styleId="854">
     <w:name w:val="Subtitle"/>
-    <w:basedOn w:val="664"/>
-    <w:next w:val="664"/>
-    <w:link w:val="162"/>
+    <w:basedOn w:val="892"/>
+    <w:next w:val="892"/>
+    <w:link w:val="855"/>
     <w:uiPriority w:val="11"/>
     <w:qFormat/>
     <w:pPr>
@@ -30259,10 +31152,10 @@
       <w:szCs w:val="28"/>
     </w:rPr>
   </w:style>
-  <w:style w:type="character" w:styleId="162">
+  <w:style w:type="character" w:styleId="855">
     <w:name w:val="Subtitle Char"/>
-    <w:basedOn w:val="148"/>
-    <w:link w:val="161"/>
+    <w:basedOn w:val="842"/>
+    <w:link w:val="854"/>
     <w:uiPriority w:val="11"/>
     <w:pPr>
       <w:pBdr/>
@@ -30276,11 +31169,11 @@
       <w:szCs w:val="28"/>
     </w:rPr>
   </w:style>
-  <w:style w:type="paragraph" w:styleId="163">
+  <w:style w:type="paragraph" w:styleId="856">
     <w:name w:val="Quote"/>
-    <w:basedOn w:val="664"/>
-    <w:next w:val="664"/>
-    <w:link w:val="164"/>
+    <w:basedOn w:val="892"/>
+    <w:next w:val="892"/>
+    <w:link w:val="857"/>
     <w:uiPriority w:val="29"/>
     <w:qFormat/>
     <w:pPr>
@@ -30295,10 +31188,10 @@
       <w:color w:val="404040" w:themeColor="text1" w:themeTint="BF"/>
     </w:rPr>
   </w:style>
-  <w:style w:type="character" w:styleId="164">
+  <w:style w:type="character" w:styleId="857">
     <w:name w:val="Quote Char"/>
-    <w:basedOn w:val="148"/>
-    <w:link w:val="163"/>
+    <w:basedOn w:val="842"/>
+    <w:link w:val="856"/>
     <w:uiPriority w:val="29"/>
     <w:pPr>
       <w:pBdr/>
@@ -30311,9 +31204,9 @@
       <w:color w:val="404040" w:themeColor="text1" w:themeTint="BF"/>
     </w:rPr>
   </w:style>
-  <w:style w:type="character" w:styleId="166">
+  <w:style w:type="character" w:styleId="858">
     <w:name w:val="Intense Emphasis"/>
-    <w:basedOn w:val="148"/>
+    <w:basedOn w:val="842"/>
     <w:uiPriority w:val="21"/>
     <w:qFormat/>
     <w:pPr>
@@ -30327,11 +31220,11 @@
       <w:color w:val="0f4761" w:themeColor="accent1" w:themeShade="BF"/>
     </w:rPr>
   </w:style>
-  <w:style w:type="paragraph" w:styleId="167">
+  <w:style w:type="paragraph" w:styleId="859">
     <w:name w:val="Intense Quote"/>
-    <w:basedOn w:val="664"/>
-    <w:next w:val="664"/>
-    <w:link w:val="168"/>
+    <w:basedOn w:val="892"/>
+    <w:next w:val="892"/>
+    <w:link w:val="860"/>
     <w:uiPriority w:val="30"/>
     <w:qFormat/>
     <w:pPr>
@@ -30349,10 +31242,10 @@
       <w:color w:val="0f4761" w:themeColor="accent1" w:themeShade="BF"/>
     </w:rPr>
   </w:style>
-  <w:style w:type="character" w:styleId="168">
+  <w:style w:type="character" w:styleId="860">
     <w:name w:val="Intense Quote Char"/>
-    <w:basedOn w:val="148"/>
-    <w:link w:val="167"/>
+    <w:basedOn w:val="842"/>
+    <w:link w:val="859"/>
     <w:uiPriority w:val="30"/>
     <w:pPr>
       <w:pBdr/>
@@ -30365,9 +31258,9 @@
       <w:color w:val="0f4761" w:themeColor="accent1" w:themeShade="BF"/>
     </w:rPr>
   </w:style>
-  <w:style w:type="character" w:styleId="169">
+  <w:style w:type="character" w:styleId="861">
     <w:name w:val="Intense Reference"/>
-    <w:basedOn w:val="148"/>
+    <w:basedOn w:val="842"/>
     <w:uiPriority w:val="32"/>
     <w:qFormat/>
     <w:pPr>
@@ -30383,9 +31276,9 @@
       <w:spacing w:val="5"/>
     </w:rPr>
   </w:style>
-  <w:style w:type="character" w:styleId="171">
+  <w:style w:type="character" w:styleId="862">
     <w:name w:val="Subtle Emphasis"/>
-    <w:basedOn w:val="148"/>
+    <w:basedOn w:val="842"/>
     <w:uiPriority w:val="19"/>
     <w:qFormat/>
     <w:pPr>
@@ -30399,9 +31292,9 @@
       <w:color w:val="404040" w:themeColor="text1" w:themeTint="BF"/>
     </w:rPr>
   </w:style>
-  <w:style w:type="character" w:styleId="172">
+  <w:style w:type="character" w:styleId="863">
     <w:name w:val="Emphasis"/>
-    <w:basedOn w:val="148"/>
+    <w:basedOn w:val="842"/>
     <w:uiPriority w:val="20"/>
     <w:qFormat/>
     <w:pPr>
@@ -30414,9 +31307,9 @@
       <w:iCs/>
     </w:rPr>
   </w:style>
-  <w:style w:type="character" w:styleId="173">
+  <w:style w:type="paragraph" w:styleId="864">
     <w:name w:val="Strong"/>
-    <w:basedOn w:val="148"/>
+    <w:basedOn w:val="842"/>
     <w:uiPriority w:val="22"/>
     <w:qFormat/>
     <w:pPr>
@@ -30427,11 +31320,15 @@
     <w:rPr>
       <w:b/>
       <w:bCs/>
+      <w:color w:val="0d0d0d" w:themeColor="text1" w:themeTint="F2"/>
+      <w:sz w:val="32"/>
+      <w:szCs w:val="32"/>
+      <w:u w:val="single"/>
     </w:rPr>
   </w:style>
-  <w:style w:type="character" w:styleId="174">
+  <w:style w:type="character" w:styleId="865">
     <w:name w:val="Subtle Reference"/>
-    <w:basedOn w:val="148"/>
+    <w:basedOn w:val="842"/>
     <w:uiPriority w:val="31"/>
     <w:qFormat/>
     <w:pPr>
@@ -30444,9 +31341,9 @@
       <w:color w:val="5a5a5a" w:themeColor="text1" w:themeTint="A5"/>
     </w:rPr>
   </w:style>
-  <w:style w:type="character" w:styleId="175">
+  <w:style w:type="character" w:styleId="866">
     <w:name w:val="Book Title"/>
-    <w:basedOn w:val="148"/>
+    <w:basedOn w:val="842"/>
     <w:uiPriority w:val="33"/>
     <w:qFormat/>
     <w:pPr>
@@ -30462,10 +31359,10 @@
       <w:spacing w:val="5"/>
     </w:rPr>
   </w:style>
-  <w:style w:type="paragraph" w:styleId="176">
+  <w:style w:type="paragraph" w:styleId="867">
     <w:name w:val="Header"/>
-    <w:basedOn w:val="664"/>
-    <w:link w:val="177"/>
+    <w:basedOn w:val="892"/>
+    <w:link w:val="868"/>
     <w:uiPriority w:val="99"/>
     <w:unhideWhenUsed/>
     <w:pPr>
@@ -30478,10 +31375,10 @@
       <w:ind/>
     </w:pPr>
   </w:style>
-  <w:style w:type="character" w:styleId="177">
+  <w:style w:type="character" w:styleId="868">
     <w:name w:val="Header Char"/>
-    <w:basedOn w:val="148"/>
-    <w:link w:val="176"/>
+    <w:basedOn w:val="842"/>
+    <w:link w:val="867"/>
     <w:uiPriority w:val="99"/>
     <w:pPr>
       <w:pBdr/>
@@ -30489,10 +31386,10 @@
       <w:ind/>
     </w:pPr>
   </w:style>
-  <w:style w:type="paragraph" w:styleId="178">
+  <w:style w:type="paragraph" w:styleId="869">
     <w:name w:val="Footer"/>
-    <w:basedOn w:val="664"/>
-    <w:link w:val="179"/>
+    <w:basedOn w:val="892"/>
+    <w:link w:val="870"/>
     <w:uiPriority w:val="99"/>
     <w:unhideWhenUsed/>
     <w:pPr>
@@ -30505,10 +31402,10 @@
       <w:ind/>
     </w:pPr>
   </w:style>
-  <w:style w:type="character" w:styleId="179">
+  <w:style w:type="character" w:styleId="870">
     <w:name w:val="Footer Char"/>
-    <w:basedOn w:val="148"/>
-    <w:link w:val="178"/>
+    <w:basedOn w:val="842"/>
+    <w:link w:val="869"/>
     <w:uiPriority w:val="99"/>
     <w:pPr>
       <w:pBdr/>
@@ -30516,10 +31413,10 @@
       <w:ind/>
     </w:pPr>
   </w:style>
-  <w:style w:type="paragraph" w:styleId="180">
+  <w:style w:type="paragraph" w:styleId="871">
     <w:name w:val="Caption"/>
-    <w:basedOn w:val="664"/>
-    <w:next w:val="664"/>
+    <w:basedOn w:val="892"/>
+    <w:next w:val="892"/>
     <w:uiPriority w:val="35"/>
     <w:unhideWhenUsed/>
     <w:qFormat/>
@@ -30536,10 +31433,10 @@
       <w:szCs w:val="18"/>
     </w:rPr>
   </w:style>
-  <w:style w:type="paragraph" w:styleId="181">
+  <w:style w:type="paragraph" w:styleId="872">
     <w:name w:val="footnote text"/>
-    <w:basedOn w:val="664"/>
-    <w:link w:val="182"/>
+    <w:basedOn w:val="892"/>
+    <w:link w:val="873"/>
     <w:uiPriority w:val="99"/>
     <w:semiHidden/>
     <w:unhideWhenUsed/>
@@ -30553,10 +31450,10 @@
       <w:szCs w:val="20"/>
     </w:rPr>
   </w:style>
-  <w:style w:type="character" w:styleId="182">
+  <w:style w:type="character" w:styleId="873">
     <w:name w:val="Footnote Text Char"/>
-    <w:basedOn w:val="148"/>
-    <w:link w:val="181"/>
+    <w:basedOn w:val="842"/>
+    <w:link w:val="872"/>
     <w:uiPriority w:val="99"/>
     <w:semiHidden/>
     <w:pPr>
@@ -30569,9 +31466,9 @@
       <w:szCs w:val="20"/>
     </w:rPr>
   </w:style>
-  <w:style w:type="character" w:styleId="183">
+  <w:style w:type="character" w:styleId="874">
     <w:name w:val="footnote reference"/>
-    <w:basedOn w:val="148"/>
+    <w:basedOn w:val="842"/>
     <w:uiPriority w:val="99"/>
     <w:semiHidden/>
     <w:unhideWhenUsed/>
@@ -30584,10 +31481,10 @@
       <w:vertAlign w:val="superscript"/>
     </w:rPr>
   </w:style>
-  <w:style w:type="paragraph" w:styleId="184">
+  <w:style w:type="paragraph" w:styleId="875">
     <w:name w:val="endnote text"/>
-    <w:basedOn w:val="664"/>
-    <w:link w:val="185"/>
+    <w:basedOn w:val="892"/>
+    <w:link w:val="876"/>
     <w:uiPriority w:val="99"/>
     <w:semiHidden/>
     <w:unhideWhenUsed/>
@@ -30601,10 +31498,10 @@
       <w:szCs w:val="20"/>
     </w:rPr>
   </w:style>
-  <w:style w:type="character" w:styleId="185">
+  <w:style w:type="character" w:styleId="876">
     <w:name w:val="Endnote Text Char"/>
-    <w:basedOn w:val="148"/>
-    <w:link w:val="184"/>
+    <w:basedOn w:val="842"/>
+    <w:link w:val="875"/>
     <w:uiPriority w:val="99"/>
     <w:semiHidden/>
     <w:pPr>
@@ -30617,9 +31514,9 @@
       <w:szCs w:val="20"/>
     </w:rPr>
   </w:style>
-  <w:style w:type="character" w:styleId="186">
+  <w:style w:type="character" w:styleId="877">
     <w:name w:val="endnote reference"/>
-    <w:basedOn w:val="148"/>
+    <w:basedOn w:val="842"/>
     <w:uiPriority w:val="99"/>
     <w:semiHidden/>
     <w:unhideWhenUsed/>
@@ -30632,9 +31529,9 @@
       <w:vertAlign w:val="superscript"/>
     </w:rPr>
   </w:style>
-  <w:style w:type="character" w:styleId="187">
+  <w:style w:type="character" w:styleId="878">
     <w:name w:val="Hyperlink"/>
-    <w:basedOn w:val="148"/>
+    <w:basedOn w:val="842"/>
     <w:uiPriority w:val="99"/>
     <w:unhideWhenUsed/>
     <w:pPr>
@@ -30647,9 +31544,9 @@
       <w:u w:val="single"/>
     </w:rPr>
   </w:style>
-  <w:style w:type="character" w:styleId="188">
+  <w:style w:type="character" w:styleId="879">
     <w:name w:val="FollowedHyperlink"/>
-    <w:basedOn w:val="148"/>
+    <w:basedOn w:val="842"/>
     <w:uiPriority w:val="99"/>
     <w:semiHidden/>
     <w:unhideWhenUsed/>
@@ -30663,10 +31560,10 @@
       <w:u w:val="single"/>
     </w:rPr>
   </w:style>
-  <w:style w:type="paragraph" w:styleId="189">
+  <w:style w:type="paragraph" w:styleId="880">
     <w:name w:val="toc 1"/>
-    <w:basedOn w:val="664"/>
-    <w:next w:val="664"/>
+    <w:basedOn w:val="892"/>
+    <w:next w:val="892"/>
     <w:uiPriority w:val="39"/>
     <w:unhideWhenUsed/>
     <w:pPr>
@@ -30675,10 +31572,10 @@
       <w:ind/>
     </w:pPr>
   </w:style>
-  <w:style w:type="paragraph" w:styleId="190">
+  <w:style w:type="paragraph" w:styleId="881">
     <w:name w:val="toc 2"/>
-    <w:basedOn w:val="664"/>
-    <w:next w:val="664"/>
+    <w:basedOn w:val="892"/>
+    <w:next w:val="892"/>
     <w:uiPriority w:val="39"/>
     <w:unhideWhenUsed/>
     <w:pPr>
@@ -30687,10 +31584,10 @@
       <w:ind w:left="220"/>
     </w:pPr>
   </w:style>
-  <w:style w:type="paragraph" w:styleId="191">
+  <w:style w:type="paragraph" w:styleId="882">
     <w:name w:val="toc 3"/>
-    <w:basedOn w:val="664"/>
-    <w:next w:val="664"/>
+    <w:basedOn w:val="892"/>
+    <w:next w:val="892"/>
     <w:uiPriority w:val="39"/>
     <w:unhideWhenUsed/>
     <w:pPr>
@@ -30699,10 +31596,10 @@
       <w:ind w:left="440"/>
     </w:pPr>
   </w:style>
-  <w:style w:type="paragraph" w:styleId="192">
+  <w:style w:type="paragraph" w:styleId="883">
     <w:name w:val="toc 4"/>
-    <w:basedOn w:val="664"/>
-    <w:next w:val="664"/>
+    <w:basedOn w:val="892"/>
+    <w:next w:val="892"/>
     <w:uiPriority w:val="39"/>
     <w:unhideWhenUsed/>
     <w:pPr>
@@ -30711,10 +31608,10 @@
       <w:ind w:left="660"/>
     </w:pPr>
   </w:style>
-  <w:style w:type="paragraph" w:styleId="193">
+  <w:style w:type="paragraph" w:styleId="884">
     <w:name w:val="toc 5"/>
-    <w:basedOn w:val="664"/>
-    <w:next w:val="664"/>
+    <w:basedOn w:val="892"/>
+    <w:next w:val="892"/>
     <w:uiPriority w:val="39"/>
     <w:unhideWhenUsed/>
     <w:pPr>
@@ -30723,10 +31620,10 @@
       <w:ind w:left="880"/>
     </w:pPr>
   </w:style>
-  <w:style w:type="paragraph" w:styleId="194">
+  <w:style w:type="paragraph" w:styleId="885">
     <w:name w:val="toc 6"/>
-    <w:basedOn w:val="664"/>
-    <w:next w:val="664"/>
+    <w:basedOn w:val="892"/>
+    <w:next w:val="892"/>
     <w:uiPriority w:val="39"/>
     <w:unhideWhenUsed/>
     <w:pPr>
@@ -30735,10 +31632,10 @@
       <w:ind w:left="1100"/>
     </w:pPr>
   </w:style>
-  <w:style w:type="paragraph" w:styleId="195">
+  <w:style w:type="paragraph" w:styleId="886">
     <w:name w:val="toc 7"/>
-    <w:basedOn w:val="664"/>
-    <w:next w:val="664"/>
+    <w:basedOn w:val="892"/>
+    <w:next w:val="892"/>
     <w:uiPriority w:val="39"/>
     <w:unhideWhenUsed/>
     <w:pPr>
@@ -30747,10 +31644,10 @@
       <w:ind w:left="1320"/>
     </w:pPr>
   </w:style>
-  <w:style w:type="paragraph" w:styleId="196">
+  <w:style w:type="paragraph" w:styleId="887">
     <w:name w:val="toc 8"/>
-    <w:basedOn w:val="664"/>
-    <w:next w:val="664"/>
+    <w:basedOn w:val="892"/>
+    <w:next w:val="892"/>
     <w:uiPriority w:val="39"/>
     <w:unhideWhenUsed/>
     <w:pPr>
@@ -30759,10 +31656,10 @@
       <w:ind w:left="1540"/>
     </w:pPr>
   </w:style>
-  <w:style w:type="paragraph" w:styleId="197">
+  <w:style w:type="paragraph" w:styleId="888">
     <w:name w:val="toc 9"/>
-    <w:basedOn w:val="664"/>
-    <w:next w:val="664"/>
+    <w:basedOn w:val="892"/>
+    <w:next w:val="892"/>
     <w:uiPriority w:val="39"/>
     <w:unhideWhenUsed/>
     <w:pPr>
@@ -30771,9 +31668,9 @@
       <w:ind w:left="1760"/>
     </w:pPr>
   </w:style>
-  <w:style w:type="character" w:styleId="198">
+  <w:style w:type="character" w:styleId="889">
     <w:name w:val="Placeholder Text"/>
-    <w:basedOn w:val="148"/>
+    <w:basedOn w:val="842"/>
     <w:uiPriority w:val="99"/>
     <w:semiHidden/>
     <w:pPr>
@@ -30785,7 +31682,7 @@
       <w:color w:val="666666"/>
     </w:rPr>
   </w:style>
-  <w:style w:type="paragraph" w:styleId="208">
+  <w:style w:type="paragraph" w:styleId="890">
     <w:name w:val="TOC Heading"/>
     <w:uiPriority w:val="39"/>
     <w:unhideWhenUsed/>
@@ -30795,10 +31692,10 @@
       <w:ind/>
     </w:pPr>
   </w:style>
-  <w:style w:type="paragraph" w:styleId="209">
+  <w:style w:type="paragraph" w:styleId="891">
     <w:name w:val="table of figures"/>
-    <w:basedOn w:val="664"/>
-    <w:next w:val="664"/>
+    <w:basedOn w:val="892"/>
+    <w:next w:val="892"/>
     <w:uiPriority w:val="99"/>
     <w:unhideWhenUsed/>
     <w:pPr>
@@ -30807,7 +31704,7 @@
       <w:ind/>
     </w:pPr>
   </w:style>
-  <w:style w:type="paragraph" w:styleId="664" w:default="1">
+  <w:style w:type="paragraph" w:styleId="892" w:default="1">
     <w:name w:val="Normal"/>
     <w:qFormat/>
     <w:pPr>
@@ -30816,7 +31713,7 @@
       <w:ind/>
     </w:pPr>
   </w:style>
-  <w:style w:type="table" w:styleId="665" w:default="1">
+  <w:style w:type="table" w:styleId="893" w:default="1">
     <w:name w:val="Normal Table"/>
     <w:uiPriority w:val="99"/>
     <w:semiHidden/>
@@ -31009,7 +31906,7 @@
       </w:tcPr>
     </w:tblStylePr>
   </w:style>
-  <w:style w:type="numbering" w:styleId="666" w:default="1">
+  <w:style w:type="numbering" w:styleId="894" w:default="1">
     <w:name w:val="No List"/>
     <w:uiPriority w:val="99"/>
     <w:semiHidden/>
@@ -31020,9 +31917,9 @@
       <w:ind/>
     </w:pPr>
   </w:style>
-  <w:style w:type="paragraph" w:styleId="667">
+  <w:style w:type="paragraph" w:styleId="895">
     <w:name w:val="No Spacing"/>
-    <w:basedOn w:val="664"/>
+    <w:basedOn w:val="892"/>
     <w:uiPriority w:val="1"/>
     <w:qFormat/>
     <w:pPr>
@@ -31031,9 +31928,9 @@
       <w:ind/>
     </w:pPr>
   </w:style>
-  <w:style w:type="paragraph" w:styleId="668">
+  <w:style w:type="paragraph" w:styleId="896">
     <w:name w:val="List Paragraph"/>
-    <w:basedOn w:val="664"/>
+    <w:basedOn w:val="892"/>
     <w:uiPriority w:val="34"/>
     <w:qFormat/>
     <w:pPr>

</xml_diff>